<commit_message>
Refactors file path handling and updates window geometry for improved layout
</commit_message>
<xml_diff>
--- a/GUI Assessment/Planing Documents/Liam's AS91897 Assessment.docx
+++ b/GUI Assessment/Planing Documents/Liam's AS91897 Assessment.docx
@@ -1163,6 +1163,16 @@
           <w:sz w:val="22"/>
           <w:szCs w:val="22"/>
         </w:rPr>
+        <w:t>:</w:t>
+      </w:r>
+      <w:r>
+        <w:rPr>
+          <w:rFonts w:ascii="Arial" w:eastAsia="Calibri" w:hAnsi="Arial" w:cs="Arial"/>
+          <w:b/>
+          <w:bCs/>
+          <w:sz w:val="22"/>
+          <w:szCs w:val="22"/>
+        </w:rPr>
         <w:t xml:space="preserve"> </w:t>
       </w:r>
       <w:r>
@@ -1173,17 +1183,7 @@
           <w:sz w:val="22"/>
           <w:szCs w:val="22"/>
         </w:rPr>
-        <w:t>:</w:t>
-      </w:r>
-      <w:r>
-        <w:rPr>
-          <w:rFonts w:ascii="Arial" w:eastAsia="Calibri" w:hAnsi="Arial" w:cs="Arial"/>
-          <w:b/>
-          <w:bCs/>
-          <w:sz w:val="22"/>
-          <w:szCs w:val="22"/>
-        </w:rPr>
-        <w:t>……………………</w:t>
+        <w:t>Liam Hohn</w:t>
       </w:r>
       <w:r>
         <w:rPr>
@@ -1786,8 +1786,39 @@
           <w:sz w:val="28"/>
           <w:szCs w:val="28"/>
         </w:rPr>
-        <w:t>Context/Te Horopaki</w:t>
-      </w:r>
+        <w:t>Context/</w:t>
+      </w:r>
+      <w:proofErr w:type="spellStart"/>
+      <w:r>
+        <w:rPr>
+          <w:rFonts w:ascii="Arial" w:eastAsia="Arial" w:hAnsi="Arial" w:cs="Arial"/>
+          <w:b/>
+          <w:sz w:val="28"/>
+          <w:szCs w:val="28"/>
+        </w:rPr>
+        <w:t>Te</w:t>
+      </w:r>
+      <w:proofErr w:type="spellEnd"/>
+      <w:r>
+        <w:rPr>
+          <w:rFonts w:ascii="Arial" w:eastAsia="Arial" w:hAnsi="Arial" w:cs="Arial"/>
+          <w:b/>
+          <w:sz w:val="28"/>
+          <w:szCs w:val="28"/>
+        </w:rPr>
+        <w:t xml:space="preserve"> </w:t>
+      </w:r>
+      <w:proofErr w:type="spellStart"/>
+      <w:r>
+        <w:rPr>
+          <w:rFonts w:ascii="Arial" w:eastAsia="Arial" w:hAnsi="Arial" w:cs="Arial"/>
+          <w:b/>
+          <w:sz w:val="28"/>
+          <w:szCs w:val="28"/>
+        </w:rPr>
+        <w:t>Horopaki</w:t>
+      </w:r>
+      <w:proofErr w:type="spellEnd"/>
     </w:p>
     <w:p>
       <w:pPr>
@@ -1855,7 +1886,25 @@
           <w:sz w:val="22"/>
           <w:szCs w:val="22"/>
         </w:rPr>
-        <w:t xml:space="preserve">Students will use python programming language and tkinter, as it supports a range of advanced programming techniques.  </w:t>
+        <w:t xml:space="preserve">Students will use python programming language and </w:t>
+      </w:r>
+      <w:proofErr w:type="spellStart"/>
+      <w:r>
+        <w:rPr>
+          <w:rFonts w:ascii="Arial" w:eastAsia="Arial" w:hAnsi="Arial" w:cs="Arial"/>
+          <w:sz w:val="22"/>
+          <w:szCs w:val="22"/>
+        </w:rPr>
+        <w:t>tkinter</w:t>
+      </w:r>
+      <w:proofErr w:type="spellEnd"/>
+      <w:r>
+        <w:rPr>
+          <w:rFonts w:ascii="Arial" w:eastAsia="Arial" w:hAnsi="Arial" w:cs="Arial"/>
+          <w:sz w:val="22"/>
+          <w:szCs w:val="22"/>
+        </w:rPr>
+        <w:t xml:space="preserve">, as it supports a range of advanced programming techniques.  </w:t>
       </w:r>
     </w:p>
     <w:p>
@@ -1873,7 +1922,27 @@
           <w:sz w:val="28"/>
           <w:szCs w:val="28"/>
         </w:rPr>
-        <w:t>Conditions/Ngā Tikanga</w:t>
+        <w:t>Conditions/</w:t>
+      </w:r>
+      <w:proofErr w:type="spellStart"/>
+      <w:r>
+        <w:rPr>
+          <w:rFonts w:ascii="Arial" w:eastAsia="Arial" w:hAnsi="Arial" w:cs="Arial"/>
+          <w:b/>
+          <w:sz w:val="28"/>
+          <w:szCs w:val="28"/>
+        </w:rPr>
+        <w:t>Ngā</w:t>
+      </w:r>
+      <w:proofErr w:type="spellEnd"/>
+      <w:r>
+        <w:rPr>
+          <w:rFonts w:ascii="Arial" w:eastAsia="Arial" w:hAnsi="Arial" w:cs="Arial"/>
+          <w:b/>
+          <w:sz w:val="28"/>
+          <w:szCs w:val="28"/>
+        </w:rPr>
+        <w:t xml:space="preserve"> Tikanga</w:t>
       </w:r>
     </w:p>
     <w:p>
@@ -1914,8 +1983,39 @@
           <w:sz w:val="28"/>
           <w:szCs w:val="28"/>
         </w:rPr>
-        <w:t>Resource requirements/Ngā Rauemi</w:t>
-      </w:r>
+        <w:t>Resource requirements/</w:t>
+      </w:r>
+      <w:proofErr w:type="spellStart"/>
+      <w:r>
+        <w:rPr>
+          <w:rFonts w:ascii="Arial" w:eastAsia="Arial" w:hAnsi="Arial" w:cs="Arial"/>
+          <w:b/>
+          <w:sz w:val="28"/>
+          <w:szCs w:val="28"/>
+        </w:rPr>
+        <w:t>Ngā</w:t>
+      </w:r>
+      <w:proofErr w:type="spellEnd"/>
+      <w:r>
+        <w:rPr>
+          <w:rFonts w:ascii="Arial" w:eastAsia="Arial" w:hAnsi="Arial" w:cs="Arial"/>
+          <w:b/>
+          <w:sz w:val="28"/>
+          <w:szCs w:val="28"/>
+        </w:rPr>
+        <w:t xml:space="preserve"> </w:t>
+      </w:r>
+      <w:proofErr w:type="spellStart"/>
+      <w:r>
+        <w:rPr>
+          <w:rFonts w:ascii="Arial" w:eastAsia="Arial" w:hAnsi="Arial" w:cs="Arial"/>
+          <w:b/>
+          <w:sz w:val="28"/>
+          <w:szCs w:val="28"/>
+        </w:rPr>
+        <w:t>Rauemi</w:t>
+      </w:r>
+      <w:proofErr w:type="spellEnd"/>
     </w:p>
     <w:p>
       <w:pPr>
@@ -3949,7 +4049,27 @@
           <w:sz w:val="22"/>
           <w:szCs w:val="22"/>
         </w:rPr>
-        <w:t xml:space="preserve">Teams, Microsoft Tasks, Microsoft ToDo, Fleep, Monday.com. These can be used to showcase your development for feedback from end users. Google Forms can be used to gather feedback, or a questionnaire created in other software such as Microsoft Word. Choosing the right collaborative tool is important for sharing your development with end users and collecting feedback. Slack, for example, can be integrated with Google Forms. </w:t>
+        <w:t xml:space="preserve">Teams, Microsoft Tasks, Microsoft </w:t>
+      </w:r>
+      <w:proofErr w:type="spellStart"/>
+      <w:r>
+        <w:rPr>
+          <w:rFonts w:ascii="Arial" w:eastAsia="Arial" w:hAnsi="Arial" w:cs="Arial"/>
+          <w:color w:val="000000"/>
+          <w:sz w:val="22"/>
+          <w:szCs w:val="22"/>
+        </w:rPr>
+        <w:t>ToDo</w:t>
+      </w:r>
+      <w:proofErr w:type="spellEnd"/>
+      <w:r>
+        <w:rPr>
+          <w:rFonts w:ascii="Arial" w:eastAsia="Arial" w:hAnsi="Arial" w:cs="Arial"/>
+          <w:color w:val="000000"/>
+          <w:sz w:val="22"/>
+          <w:szCs w:val="22"/>
+        </w:rPr>
+        <w:t xml:space="preserve">, Fleep, Monday.com. These can be used to showcase your development for feedback from end users. Google Forms can be used to gather feedback, or a questionnaire created in other software such as Microsoft Word. Choosing the right collaborative tool is important for sharing your development with end users and collecting feedback. Slack, for example, can be integrated with Google Forms. </w:t>
       </w:r>
     </w:p>
     <w:p>
@@ -4507,63 +4627,6 @@
                 <pic:pic xmlns:pic="http://schemas.openxmlformats.org/drawingml/2006/picture">
                   <pic:nvPicPr>
                     <pic:cNvPr id="0" name="Picture 1"/>
-                    <pic:cNvPicPr>
-                      <a:picLocks noChangeAspect="1" noChangeArrowheads="1"/>
-                    </pic:cNvPicPr>
-                  </pic:nvPicPr>
-                  <pic:blipFill>
-                    <a:blip r:embed="rId6">
-                      <a:extLst>
-                        <a:ext uri="{28A0092B-C50C-407E-A947-70E740481C1C}">
-                          <a14:useLocalDpi xmlns:a14="http://schemas.microsoft.com/office/drawing/2010/main" val="0"/>
-                        </a:ext>
-                      </a:extLst>
-                    </a:blip>
-                    <a:srcRect/>
-                    <a:stretch>
-                      <a:fillRect/>
-                    </a:stretch>
-                  </pic:blipFill>
-                  <pic:spPr bwMode="auto">
-                    <a:xfrm>
-                      <a:off x="0" y="0"/>
-                      <a:ext cx="5724525" cy="3219450"/>
-                    </a:xfrm>
-                    <a:prstGeom prst="rect">
-                      <a:avLst/>
-                    </a:prstGeom>
-                    <a:noFill/>
-                    <a:ln>
-                      <a:noFill/>
-                    </a:ln>
-                  </pic:spPr>
-                </pic:pic>
-              </a:graphicData>
-            </a:graphic>
-          </wp:inline>
-        </w:drawing>
-      </w:r>
-      <w:r>
-        <w:rPr>
-          <w:rFonts w:ascii="Arial" w:eastAsia="Arial" w:hAnsi="Arial" w:cs="Arial"/>
-          <w:noProof/>
-          <w:color w:val="000000"/>
-          <w:sz w:val="24"/>
-          <w:szCs w:val="24"/>
-        </w:rPr>
-        <w:drawing>
-          <wp:inline distT="0" distB="0" distL="0" distR="0" wp14:anchorId="0E5B8783" wp14:editId="4C717787">
-            <wp:extent cx="5724525" cy="3219450"/>
-            <wp:effectExtent l="0" t="0" r="9525" b="0"/>
-            <wp:docPr id="1581610238" name="Picture 2"/>
-            <wp:cNvGraphicFramePr>
-              <a:graphicFrameLocks xmlns:a="http://schemas.openxmlformats.org/drawingml/2006/main" noChangeAspect="1"/>
-            </wp:cNvGraphicFramePr>
-            <a:graphic xmlns:a="http://schemas.openxmlformats.org/drawingml/2006/main">
-              <a:graphicData uri="http://schemas.openxmlformats.org/drawingml/2006/picture">
-                <pic:pic xmlns:pic="http://schemas.openxmlformats.org/drawingml/2006/picture">
-                  <pic:nvPicPr>
-                    <pic:cNvPr id="0" name="Picture 2"/>
                     <pic:cNvPicPr>
                       <a:picLocks noChangeAspect="1" noChangeArrowheads="1"/>
                     </pic:cNvPicPr>
@@ -4600,6 +4663,63 @@
           </wp:inline>
         </w:drawing>
       </w:r>
+      <w:r>
+        <w:rPr>
+          <w:rFonts w:ascii="Arial" w:eastAsia="Arial" w:hAnsi="Arial" w:cs="Arial"/>
+          <w:noProof/>
+          <w:color w:val="000000"/>
+          <w:sz w:val="24"/>
+          <w:szCs w:val="24"/>
+        </w:rPr>
+        <w:drawing>
+          <wp:inline distT="0" distB="0" distL="0" distR="0" wp14:anchorId="0E5B8783" wp14:editId="4C717787">
+            <wp:extent cx="5724525" cy="3219450"/>
+            <wp:effectExtent l="0" t="0" r="9525" b="0"/>
+            <wp:docPr id="1581610238" name="Picture 2"/>
+            <wp:cNvGraphicFramePr>
+              <a:graphicFrameLocks xmlns:a="http://schemas.openxmlformats.org/drawingml/2006/main" noChangeAspect="1"/>
+            </wp:cNvGraphicFramePr>
+            <a:graphic xmlns:a="http://schemas.openxmlformats.org/drawingml/2006/main">
+              <a:graphicData uri="http://schemas.openxmlformats.org/drawingml/2006/picture">
+                <pic:pic xmlns:pic="http://schemas.openxmlformats.org/drawingml/2006/picture">
+                  <pic:nvPicPr>
+                    <pic:cNvPr id="0" name="Picture 2"/>
+                    <pic:cNvPicPr>
+                      <a:picLocks noChangeAspect="1" noChangeArrowheads="1"/>
+                    </pic:cNvPicPr>
+                  </pic:nvPicPr>
+                  <pic:blipFill>
+                    <a:blip r:embed="rId8">
+                      <a:extLst>
+                        <a:ext uri="{28A0092B-C50C-407E-A947-70E740481C1C}">
+                          <a14:useLocalDpi xmlns:a14="http://schemas.microsoft.com/office/drawing/2010/main" val="0"/>
+                        </a:ext>
+                      </a:extLst>
+                    </a:blip>
+                    <a:srcRect/>
+                    <a:stretch>
+                      <a:fillRect/>
+                    </a:stretch>
+                  </pic:blipFill>
+                  <pic:spPr bwMode="auto">
+                    <a:xfrm>
+                      <a:off x="0" y="0"/>
+                      <a:ext cx="5724525" cy="3219450"/>
+                    </a:xfrm>
+                    <a:prstGeom prst="rect">
+                      <a:avLst/>
+                    </a:prstGeom>
+                    <a:noFill/>
+                    <a:ln>
+                      <a:noFill/>
+                    </a:ln>
+                  </pic:spPr>
+                </pic:pic>
+              </a:graphicData>
+            </a:graphic>
+          </wp:inline>
+        </w:drawing>
+      </w:r>
     </w:p>
     <w:p>
       <w:pPr>
@@ -4662,7 +4782,7 @@
           <w:noProof/>
         </w:rPr>
         <w:drawing>
-          <wp:inline distT="0" distB="0" distL="0" distR="0" wp14:anchorId="69FBBF34" wp14:editId="47852C61">
+          <wp:inline distT="0" distB="0" distL="0" distR="0" wp14:anchorId="69FBBF34" wp14:editId="22070FB2">
             <wp:extent cx="3929260" cy="2209800"/>
             <wp:effectExtent l="0" t="0" r="0" b="0"/>
             <wp:docPr id="2139797031" name="Picture 6"/>
@@ -4679,7 +4799,7 @@
                     </pic:cNvPicPr>
                   </pic:nvPicPr>
                   <pic:blipFill>
-                    <a:blip r:embed="rId8" cstate="print">
+                    <a:blip r:embed="rId9" cstate="print">
                       <a:extLst>
                         <a:ext uri="{28A0092B-C50C-407E-A947-70E740481C1C}">
                           <a14:useLocalDpi xmlns:a14="http://schemas.microsoft.com/office/drawing/2010/main" val="0"/>
@@ -4736,7 +4856,7 @@
                     </pic:cNvPicPr>
                   </pic:nvPicPr>
                   <pic:blipFill>
-                    <a:blip r:embed="rId9" cstate="print">
+                    <a:blip r:embed="rId10" cstate="print">
                       <a:extLst>
                         <a:ext uri="{28A0092B-C50C-407E-A947-70E740481C1C}">
                           <a14:useLocalDpi xmlns:a14="http://schemas.microsoft.com/office/drawing/2010/main" val="0"/>
@@ -4793,7 +4913,7 @@
                     </pic:cNvPicPr>
                   </pic:nvPicPr>
                   <pic:blipFill>
-                    <a:blip r:embed="rId10" cstate="print">
+                    <a:blip r:embed="rId11" cstate="print">
                       <a:extLst>
                         <a:ext uri="{28A0092B-C50C-407E-A947-70E740481C1C}">
                           <a14:useLocalDpi xmlns:a14="http://schemas.microsoft.com/office/drawing/2010/main" val="0"/>
@@ -4913,7 +5033,7 @@
                     </pic:cNvPicPr>
                   </pic:nvPicPr>
                   <pic:blipFill>
-                    <a:blip r:embed="rId11">
+                    <a:blip r:embed="rId12">
                       <a:extLst>
                         <a:ext uri="{28A0092B-C50C-407E-A947-70E740481C1C}">
                           <a14:useLocalDpi xmlns:a14="http://schemas.microsoft.com/office/drawing/2010/main" val="0"/>
@@ -4970,7 +5090,7 @@
                     </pic:cNvPicPr>
                   </pic:nvPicPr>
                   <pic:blipFill>
-                    <a:blip r:embed="rId12" cstate="print">
+                    <a:blip r:embed="rId13" cstate="print">
                       <a:extLst>
                         <a:ext uri="{28A0092B-C50C-407E-A947-70E740481C1C}">
                           <a14:useLocalDpi xmlns:a14="http://schemas.microsoft.com/office/drawing/2010/main" val="0"/>
@@ -5027,7 +5147,7 @@
                     </pic:cNvPicPr>
                   </pic:nvPicPr>
                   <pic:blipFill>
-                    <a:blip r:embed="rId13">
+                    <a:blip r:embed="rId14">
                       <a:extLst>
                         <a:ext uri="{28A0092B-C50C-407E-A947-70E740481C1C}">
                           <a14:useLocalDpi xmlns:a14="http://schemas.microsoft.com/office/drawing/2010/main" val="0"/>
@@ -5241,6 +5361,42 @@
       <w:pPr>
         <w:rPr>
           <w:rFonts w:ascii="Arial" w:eastAsia="Arial" w:hAnsi="Arial" w:cs="Arial"/>
+          <w:b/>
+          <w:bCs/>
+          <w:color w:val="000000"/>
+          <w:sz w:val="32"/>
+          <w:szCs w:val="32"/>
+        </w:rPr>
+      </w:pPr>
+    </w:p>
+    <w:p>
+      <w:pPr>
+        <w:rPr>
+          <w:rFonts w:ascii="Arial" w:eastAsia="Arial" w:hAnsi="Arial" w:cs="Arial"/>
+          <w:b/>
+          <w:bCs/>
+          <w:color w:val="000000"/>
+          <w:sz w:val="32"/>
+          <w:szCs w:val="32"/>
+        </w:rPr>
+      </w:pPr>
+    </w:p>
+    <w:p>
+      <w:pPr>
+        <w:rPr>
+          <w:rFonts w:ascii="Arial" w:eastAsia="Arial" w:hAnsi="Arial" w:cs="Arial"/>
+          <w:b/>
+          <w:bCs/>
+          <w:color w:val="000000"/>
+          <w:sz w:val="32"/>
+          <w:szCs w:val="32"/>
+        </w:rPr>
+      </w:pPr>
+    </w:p>
+    <w:p>
+      <w:pPr>
+        <w:rPr>
+          <w:rFonts w:ascii="Arial" w:eastAsia="Arial" w:hAnsi="Arial" w:cs="Arial"/>
           <w:color w:val="000000"/>
           <w:sz w:val="24"/>
           <w:szCs w:val="24"/>
@@ -5447,7 +5603,7 @@
           <w:szCs w:val="36"/>
         </w:rPr>
       </w:pPr>
-      <w:hyperlink r:id="rId14" w:history="1">
+      <w:hyperlink r:id="rId15" w:history="1">
         <w:r>
           <w:rPr>
             <w:rStyle w:val="Hyperlink"/>
@@ -5478,7 +5634,7 @@
           <w:szCs w:val="36"/>
         </w:rPr>
       </w:pPr>
-      <w:hyperlink r:id="rId15" w:history="1">
+      <w:hyperlink r:id="rId16" w:history="1">
         <w:r>
           <w:rPr>
             <w:rStyle w:val="Hyperlink"/>
@@ -5567,761 +5723,6 @@
       </w:r>
     </w:p>
     <w:p/>
-    <w:tbl>
-      <w:tblPr>
-        <w:tblW w:w="9945" w:type="dxa"/>
-        <w:tblInd w:w="-270" w:type="dxa"/>
-        <w:tblBorders>
-          <w:top w:val="single" w:sz="8" w:space="0" w:color="000000"/>
-          <w:left w:val="single" w:sz="8" w:space="0" w:color="000000"/>
-          <w:bottom w:val="single" w:sz="8" w:space="0" w:color="000000"/>
-          <w:right w:val="single" w:sz="8" w:space="0" w:color="000000"/>
-          <w:insideH w:val="single" w:sz="8" w:space="0" w:color="000000"/>
-          <w:insideV w:val="single" w:sz="8" w:space="0" w:color="000000"/>
-        </w:tblBorders>
-        <w:tblLayout w:type="fixed"/>
-        <w:tblLook w:val="0600" w:firstRow="0" w:lastRow="0" w:firstColumn="0" w:lastColumn="0" w:noHBand="1" w:noVBand="1"/>
-      </w:tblPr>
-      <w:tblGrid>
-        <w:gridCol w:w="660"/>
-        <w:gridCol w:w="1215"/>
-        <w:gridCol w:w="2505"/>
-        <w:gridCol w:w="5565"/>
-      </w:tblGrid>
-      <w:tr>
-        <w:trPr>
-          <w:trHeight w:val="420"/>
-        </w:trPr>
-        <w:tc>
-          <w:tcPr>
-            <w:tcW w:w="660" w:type="dxa"/>
-            <w:vMerge w:val="restart"/>
-            <w:shd w:val="clear" w:color="auto" w:fill="auto"/>
-            <w:tcMar>
-              <w:top w:w="100" w:type="dxa"/>
-              <w:left w:w="100" w:type="dxa"/>
-              <w:bottom w:w="100" w:type="dxa"/>
-              <w:right w:w="100" w:type="dxa"/>
-            </w:tcMar>
-          </w:tcPr>
-          <w:p>
-            <w:pPr>
-              <w:widowControl w:val="0"/>
-              <w:pBdr>
-                <w:top w:val="nil"/>
-                <w:left w:val="nil"/>
-                <w:bottom w:val="nil"/>
-                <w:right w:val="nil"/>
-                <w:between w:val="nil"/>
-              </w:pBdr>
-            </w:pPr>
-            <w:r>
-              <w:t>GUI</w:t>
-            </w:r>
-          </w:p>
-        </w:tc>
-        <w:tc>
-          <w:tcPr>
-            <w:tcW w:w="1215" w:type="dxa"/>
-            <w:shd w:val="clear" w:color="auto" w:fill="auto"/>
-            <w:tcMar>
-              <w:top w:w="100" w:type="dxa"/>
-              <w:left w:w="100" w:type="dxa"/>
-              <w:bottom w:w="100" w:type="dxa"/>
-              <w:right w:w="100" w:type="dxa"/>
-            </w:tcMar>
-          </w:tcPr>
-          <w:p>
-            <w:pPr>
-              <w:widowControl w:val="0"/>
-              <w:pBdr>
-                <w:top w:val="nil"/>
-                <w:left w:val="nil"/>
-                <w:bottom w:val="nil"/>
-                <w:right w:val="nil"/>
-                <w:between w:val="nil"/>
-              </w:pBdr>
-            </w:pPr>
-            <w:r>
-              <w:t>Window</w:t>
-            </w:r>
-          </w:p>
-        </w:tc>
-        <w:tc>
-          <w:tcPr>
-            <w:tcW w:w="2505" w:type="dxa"/>
-            <w:shd w:val="clear" w:color="auto" w:fill="auto"/>
-            <w:tcMar>
-              <w:top w:w="100" w:type="dxa"/>
-              <w:left w:w="100" w:type="dxa"/>
-              <w:bottom w:w="100" w:type="dxa"/>
-              <w:right w:w="100" w:type="dxa"/>
-            </w:tcMar>
-          </w:tcPr>
-          <w:p>
-            <w:pPr>
-              <w:widowControl w:val="0"/>
-              <w:pBdr>
-                <w:top w:val="nil"/>
-                <w:left w:val="nil"/>
-                <w:bottom w:val="nil"/>
-                <w:right w:val="nil"/>
-                <w:between w:val="nil"/>
-              </w:pBdr>
-            </w:pPr>
-          </w:p>
-        </w:tc>
-        <w:tc>
-          <w:tcPr>
-            <w:tcW w:w="5565" w:type="dxa"/>
-            <w:shd w:val="clear" w:color="auto" w:fill="auto"/>
-            <w:tcMar>
-              <w:top w:w="100" w:type="dxa"/>
-              <w:left w:w="100" w:type="dxa"/>
-              <w:bottom w:w="100" w:type="dxa"/>
-              <w:right w:w="100" w:type="dxa"/>
-            </w:tcMar>
-          </w:tcPr>
-          <w:p>
-            <w:pPr>
-              <w:widowControl w:val="0"/>
-              <w:pBdr>
-                <w:top w:val="nil"/>
-                <w:left w:val="nil"/>
-                <w:bottom w:val="nil"/>
-                <w:right w:val="nil"/>
-                <w:between w:val="nil"/>
-              </w:pBdr>
-            </w:pPr>
-          </w:p>
-        </w:tc>
-      </w:tr>
-      <w:tr>
-        <w:trPr>
-          <w:trHeight w:val="420"/>
-        </w:trPr>
-        <w:tc>
-          <w:tcPr>
-            <w:tcW w:w="660" w:type="dxa"/>
-            <w:vMerge/>
-            <w:shd w:val="clear" w:color="auto" w:fill="auto"/>
-            <w:tcMar>
-              <w:top w:w="100" w:type="dxa"/>
-              <w:left w:w="100" w:type="dxa"/>
-              <w:bottom w:w="100" w:type="dxa"/>
-              <w:right w:w="100" w:type="dxa"/>
-            </w:tcMar>
-          </w:tcPr>
-          <w:p>
-            <w:pPr>
-              <w:widowControl w:val="0"/>
-              <w:pBdr>
-                <w:top w:val="nil"/>
-                <w:left w:val="nil"/>
-                <w:bottom w:val="nil"/>
-                <w:right w:val="nil"/>
-                <w:between w:val="nil"/>
-              </w:pBdr>
-            </w:pPr>
-          </w:p>
-        </w:tc>
-        <w:tc>
-          <w:tcPr>
-            <w:tcW w:w="1215" w:type="dxa"/>
-            <w:shd w:val="clear" w:color="auto" w:fill="auto"/>
-            <w:tcMar>
-              <w:top w:w="100" w:type="dxa"/>
-              <w:left w:w="100" w:type="dxa"/>
-              <w:bottom w:w="100" w:type="dxa"/>
-              <w:right w:w="100" w:type="dxa"/>
-            </w:tcMar>
-          </w:tcPr>
-          <w:p>
-            <w:pPr>
-              <w:widowControl w:val="0"/>
-              <w:pBdr>
-                <w:top w:val="nil"/>
-                <w:left w:val="nil"/>
-                <w:bottom w:val="nil"/>
-                <w:right w:val="nil"/>
-                <w:between w:val="nil"/>
-              </w:pBdr>
-            </w:pPr>
-            <w:r>
-              <w:t>Fonts</w:t>
-            </w:r>
-          </w:p>
-        </w:tc>
-        <w:tc>
-          <w:tcPr>
-            <w:tcW w:w="2505" w:type="dxa"/>
-            <w:shd w:val="clear" w:color="auto" w:fill="auto"/>
-            <w:tcMar>
-              <w:top w:w="100" w:type="dxa"/>
-              <w:left w:w="100" w:type="dxa"/>
-              <w:bottom w:w="100" w:type="dxa"/>
-              <w:right w:w="100" w:type="dxa"/>
-            </w:tcMar>
-          </w:tcPr>
-          <w:p>
-            <w:pPr>
-              <w:widowControl w:val="0"/>
-              <w:pBdr>
-                <w:top w:val="nil"/>
-                <w:left w:val="nil"/>
-                <w:bottom w:val="nil"/>
-                <w:right w:val="nil"/>
-                <w:between w:val="nil"/>
-              </w:pBdr>
-            </w:pPr>
-          </w:p>
-        </w:tc>
-        <w:tc>
-          <w:tcPr>
-            <w:tcW w:w="5565" w:type="dxa"/>
-            <w:shd w:val="clear" w:color="auto" w:fill="auto"/>
-            <w:tcMar>
-              <w:top w:w="100" w:type="dxa"/>
-              <w:left w:w="100" w:type="dxa"/>
-              <w:bottom w:w="100" w:type="dxa"/>
-              <w:right w:w="100" w:type="dxa"/>
-            </w:tcMar>
-          </w:tcPr>
-          <w:p>
-            <w:pPr>
-              <w:widowControl w:val="0"/>
-              <w:pBdr>
-                <w:top w:val="nil"/>
-                <w:left w:val="nil"/>
-                <w:bottom w:val="nil"/>
-                <w:right w:val="nil"/>
-                <w:between w:val="nil"/>
-              </w:pBdr>
-            </w:pPr>
-          </w:p>
-        </w:tc>
-      </w:tr>
-      <w:tr>
-        <w:trPr>
-          <w:trHeight w:val="420"/>
-        </w:trPr>
-        <w:tc>
-          <w:tcPr>
-            <w:tcW w:w="660" w:type="dxa"/>
-            <w:vMerge/>
-            <w:shd w:val="clear" w:color="auto" w:fill="auto"/>
-            <w:tcMar>
-              <w:top w:w="100" w:type="dxa"/>
-              <w:left w:w="100" w:type="dxa"/>
-              <w:bottom w:w="100" w:type="dxa"/>
-              <w:right w:w="100" w:type="dxa"/>
-            </w:tcMar>
-          </w:tcPr>
-          <w:p>
-            <w:pPr>
-              <w:widowControl w:val="0"/>
-              <w:pBdr>
-                <w:top w:val="nil"/>
-                <w:left w:val="nil"/>
-                <w:bottom w:val="nil"/>
-                <w:right w:val="nil"/>
-                <w:between w:val="nil"/>
-              </w:pBdr>
-            </w:pPr>
-          </w:p>
-        </w:tc>
-        <w:tc>
-          <w:tcPr>
-            <w:tcW w:w="1215" w:type="dxa"/>
-            <w:shd w:val="clear" w:color="auto" w:fill="auto"/>
-            <w:tcMar>
-              <w:top w:w="100" w:type="dxa"/>
-              <w:left w:w="100" w:type="dxa"/>
-              <w:bottom w:w="100" w:type="dxa"/>
-              <w:right w:w="100" w:type="dxa"/>
-            </w:tcMar>
-          </w:tcPr>
-          <w:p>
-            <w:pPr>
-              <w:widowControl w:val="0"/>
-              <w:pBdr>
-                <w:top w:val="nil"/>
-                <w:left w:val="nil"/>
-                <w:bottom w:val="nil"/>
-                <w:right w:val="nil"/>
-                <w:between w:val="nil"/>
-              </w:pBdr>
-            </w:pPr>
-            <w:r>
-              <w:t>Buttons</w:t>
-            </w:r>
-          </w:p>
-        </w:tc>
-        <w:tc>
-          <w:tcPr>
-            <w:tcW w:w="2505" w:type="dxa"/>
-            <w:shd w:val="clear" w:color="auto" w:fill="auto"/>
-            <w:tcMar>
-              <w:top w:w="100" w:type="dxa"/>
-              <w:left w:w="100" w:type="dxa"/>
-              <w:bottom w:w="100" w:type="dxa"/>
-              <w:right w:w="100" w:type="dxa"/>
-            </w:tcMar>
-          </w:tcPr>
-          <w:p>
-            <w:pPr>
-              <w:widowControl w:val="0"/>
-              <w:pBdr>
-                <w:top w:val="nil"/>
-                <w:left w:val="nil"/>
-                <w:bottom w:val="nil"/>
-                <w:right w:val="nil"/>
-                <w:between w:val="nil"/>
-              </w:pBdr>
-            </w:pPr>
-          </w:p>
-        </w:tc>
-        <w:tc>
-          <w:tcPr>
-            <w:tcW w:w="5565" w:type="dxa"/>
-            <w:shd w:val="clear" w:color="auto" w:fill="auto"/>
-            <w:tcMar>
-              <w:top w:w="100" w:type="dxa"/>
-              <w:left w:w="100" w:type="dxa"/>
-              <w:bottom w:w="100" w:type="dxa"/>
-              <w:right w:w="100" w:type="dxa"/>
-            </w:tcMar>
-          </w:tcPr>
-          <w:p>
-            <w:pPr>
-              <w:widowControl w:val="0"/>
-            </w:pPr>
-          </w:p>
-        </w:tc>
-      </w:tr>
-      <w:tr>
-        <w:trPr>
-          <w:trHeight w:val="420"/>
-        </w:trPr>
-        <w:tc>
-          <w:tcPr>
-            <w:tcW w:w="660" w:type="dxa"/>
-            <w:vMerge/>
-            <w:shd w:val="clear" w:color="auto" w:fill="auto"/>
-            <w:tcMar>
-              <w:top w:w="100" w:type="dxa"/>
-              <w:left w:w="100" w:type="dxa"/>
-              <w:bottom w:w="100" w:type="dxa"/>
-              <w:right w:w="100" w:type="dxa"/>
-            </w:tcMar>
-          </w:tcPr>
-          <w:p>
-            <w:pPr>
-              <w:widowControl w:val="0"/>
-              <w:pBdr>
-                <w:top w:val="nil"/>
-                <w:left w:val="nil"/>
-                <w:bottom w:val="nil"/>
-                <w:right w:val="nil"/>
-                <w:between w:val="nil"/>
-              </w:pBdr>
-            </w:pPr>
-          </w:p>
-        </w:tc>
-        <w:tc>
-          <w:tcPr>
-            <w:tcW w:w="1215" w:type="dxa"/>
-            <w:shd w:val="clear" w:color="auto" w:fill="auto"/>
-            <w:tcMar>
-              <w:top w:w="100" w:type="dxa"/>
-              <w:left w:w="100" w:type="dxa"/>
-              <w:bottom w:w="100" w:type="dxa"/>
-              <w:right w:w="100" w:type="dxa"/>
-            </w:tcMar>
-          </w:tcPr>
-          <w:p>
-            <w:pPr>
-              <w:widowControl w:val="0"/>
-              <w:pBdr>
-                <w:top w:val="nil"/>
-                <w:left w:val="nil"/>
-                <w:bottom w:val="nil"/>
-                <w:right w:val="nil"/>
-                <w:between w:val="nil"/>
-              </w:pBdr>
-            </w:pPr>
-            <w:r>
-              <w:t>List of Party Items</w:t>
-            </w:r>
-          </w:p>
-        </w:tc>
-        <w:tc>
-          <w:tcPr>
-            <w:tcW w:w="2505" w:type="dxa"/>
-            <w:shd w:val="clear" w:color="auto" w:fill="auto"/>
-            <w:tcMar>
-              <w:top w:w="100" w:type="dxa"/>
-              <w:left w:w="100" w:type="dxa"/>
-              <w:bottom w:w="100" w:type="dxa"/>
-              <w:right w:w="100" w:type="dxa"/>
-            </w:tcMar>
-          </w:tcPr>
-          <w:p>
-            <w:pPr>
-              <w:widowControl w:val="0"/>
-              <w:pBdr>
-                <w:top w:val="nil"/>
-                <w:left w:val="nil"/>
-                <w:bottom w:val="nil"/>
-                <w:right w:val="nil"/>
-                <w:between w:val="nil"/>
-              </w:pBdr>
-            </w:pPr>
-          </w:p>
-        </w:tc>
-        <w:tc>
-          <w:tcPr>
-            <w:tcW w:w="5565" w:type="dxa"/>
-            <w:shd w:val="clear" w:color="auto" w:fill="auto"/>
-            <w:tcMar>
-              <w:top w:w="100" w:type="dxa"/>
-              <w:left w:w="100" w:type="dxa"/>
-              <w:bottom w:w="100" w:type="dxa"/>
-              <w:right w:w="100" w:type="dxa"/>
-            </w:tcMar>
-          </w:tcPr>
-          <w:p>
-            <w:pPr>
-              <w:widowControl w:val="0"/>
-              <w:pBdr>
-                <w:top w:val="nil"/>
-                <w:left w:val="nil"/>
-                <w:bottom w:val="nil"/>
-                <w:right w:val="nil"/>
-                <w:between w:val="nil"/>
-              </w:pBdr>
-              <w:rPr>
-                <w:i/>
-              </w:rPr>
-            </w:pPr>
-          </w:p>
-        </w:tc>
-      </w:tr>
-      <w:tr>
-        <w:trPr>
-          <w:trHeight w:val="1575"/>
-        </w:trPr>
-        <w:tc>
-          <w:tcPr>
-            <w:tcW w:w="660" w:type="dxa"/>
-            <w:vMerge/>
-            <w:shd w:val="clear" w:color="auto" w:fill="auto"/>
-            <w:tcMar>
-              <w:top w:w="100" w:type="dxa"/>
-              <w:left w:w="100" w:type="dxa"/>
-              <w:bottom w:w="100" w:type="dxa"/>
-              <w:right w:w="100" w:type="dxa"/>
-            </w:tcMar>
-          </w:tcPr>
-          <w:p>
-            <w:pPr>
-              <w:widowControl w:val="0"/>
-              <w:pBdr>
-                <w:top w:val="nil"/>
-                <w:left w:val="nil"/>
-                <w:bottom w:val="nil"/>
-                <w:right w:val="nil"/>
-                <w:between w:val="nil"/>
-              </w:pBdr>
-            </w:pPr>
-          </w:p>
-        </w:tc>
-        <w:tc>
-          <w:tcPr>
-            <w:tcW w:w="1215" w:type="dxa"/>
-            <w:shd w:val="clear" w:color="auto" w:fill="auto"/>
-            <w:tcMar>
-              <w:top w:w="100" w:type="dxa"/>
-              <w:left w:w="100" w:type="dxa"/>
-              <w:bottom w:w="100" w:type="dxa"/>
-              <w:right w:w="100" w:type="dxa"/>
-            </w:tcMar>
-          </w:tcPr>
-          <w:p>
-            <w:pPr>
-              <w:widowControl w:val="0"/>
-              <w:pBdr>
-                <w:top w:val="nil"/>
-                <w:left w:val="nil"/>
-                <w:bottom w:val="nil"/>
-                <w:right w:val="nil"/>
-                <w:between w:val="nil"/>
-              </w:pBdr>
-            </w:pPr>
-            <w:r>
-              <w:t>Functions</w:t>
-            </w:r>
-          </w:p>
-        </w:tc>
-        <w:tc>
-          <w:tcPr>
-            <w:tcW w:w="2505" w:type="dxa"/>
-            <w:shd w:val="clear" w:color="auto" w:fill="auto"/>
-            <w:tcMar>
-              <w:top w:w="100" w:type="dxa"/>
-              <w:left w:w="100" w:type="dxa"/>
-              <w:bottom w:w="100" w:type="dxa"/>
-              <w:right w:w="100" w:type="dxa"/>
-            </w:tcMar>
-          </w:tcPr>
-          <w:p>
-            <w:pPr>
-              <w:widowControl w:val="0"/>
-              <w:pBdr>
-                <w:top w:val="nil"/>
-                <w:left w:val="nil"/>
-                <w:bottom w:val="nil"/>
-                <w:right w:val="nil"/>
-                <w:between w:val="nil"/>
-              </w:pBdr>
-            </w:pPr>
-          </w:p>
-        </w:tc>
-        <w:tc>
-          <w:tcPr>
-            <w:tcW w:w="5565" w:type="dxa"/>
-            <w:shd w:val="clear" w:color="auto" w:fill="auto"/>
-            <w:tcMar>
-              <w:top w:w="100" w:type="dxa"/>
-              <w:left w:w="100" w:type="dxa"/>
-              <w:bottom w:w="100" w:type="dxa"/>
-              <w:right w:w="100" w:type="dxa"/>
-            </w:tcMar>
-          </w:tcPr>
-          <w:p>
-            <w:pPr>
-              <w:widowControl w:val="0"/>
-              <w:pBdr>
-                <w:top w:val="nil"/>
-                <w:left w:val="nil"/>
-                <w:bottom w:val="nil"/>
-                <w:right w:val="nil"/>
-                <w:between w:val="nil"/>
-              </w:pBdr>
-            </w:pPr>
-          </w:p>
-        </w:tc>
-      </w:tr>
-      <w:tr>
-        <w:trPr>
-          <w:trHeight w:val="1575"/>
-        </w:trPr>
-        <w:tc>
-          <w:tcPr>
-            <w:tcW w:w="660" w:type="dxa"/>
-            <w:vMerge/>
-            <w:shd w:val="clear" w:color="auto" w:fill="auto"/>
-            <w:tcMar>
-              <w:top w:w="100" w:type="dxa"/>
-              <w:left w:w="100" w:type="dxa"/>
-              <w:bottom w:w="100" w:type="dxa"/>
-              <w:right w:w="100" w:type="dxa"/>
-            </w:tcMar>
-          </w:tcPr>
-          <w:p>
-            <w:pPr>
-              <w:widowControl w:val="0"/>
-              <w:pBdr>
-                <w:top w:val="nil"/>
-                <w:left w:val="nil"/>
-                <w:bottom w:val="nil"/>
-                <w:right w:val="nil"/>
-                <w:between w:val="nil"/>
-              </w:pBdr>
-            </w:pPr>
-          </w:p>
-        </w:tc>
-        <w:tc>
-          <w:tcPr>
-            <w:tcW w:w="1215" w:type="dxa"/>
-            <w:shd w:val="clear" w:color="auto" w:fill="auto"/>
-            <w:tcMar>
-              <w:top w:w="100" w:type="dxa"/>
-              <w:left w:w="100" w:type="dxa"/>
-              <w:bottom w:w="100" w:type="dxa"/>
-              <w:right w:w="100" w:type="dxa"/>
-            </w:tcMar>
-          </w:tcPr>
-          <w:p>
-            <w:pPr>
-              <w:widowControl w:val="0"/>
-              <w:pBdr>
-                <w:top w:val="nil"/>
-                <w:left w:val="nil"/>
-                <w:bottom w:val="nil"/>
-                <w:right w:val="nil"/>
-                <w:between w:val="nil"/>
-              </w:pBdr>
-            </w:pPr>
-            <w:r>
-              <w:t>Labels</w:t>
-            </w:r>
-          </w:p>
-        </w:tc>
-        <w:tc>
-          <w:tcPr>
-            <w:tcW w:w="2505" w:type="dxa"/>
-            <w:shd w:val="clear" w:color="auto" w:fill="auto"/>
-            <w:tcMar>
-              <w:top w:w="100" w:type="dxa"/>
-              <w:left w:w="100" w:type="dxa"/>
-              <w:bottom w:w="100" w:type="dxa"/>
-              <w:right w:w="100" w:type="dxa"/>
-            </w:tcMar>
-          </w:tcPr>
-          <w:p>
-            <w:pPr>
-              <w:widowControl w:val="0"/>
-              <w:pBdr>
-                <w:top w:val="nil"/>
-                <w:left w:val="nil"/>
-                <w:bottom w:val="nil"/>
-                <w:right w:val="nil"/>
-                <w:between w:val="nil"/>
-              </w:pBdr>
-            </w:pPr>
-          </w:p>
-        </w:tc>
-        <w:tc>
-          <w:tcPr>
-            <w:tcW w:w="5565" w:type="dxa"/>
-            <w:shd w:val="clear" w:color="auto" w:fill="auto"/>
-            <w:tcMar>
-              <w:top w:w="100" w:type="dxa"/>
-              <w:left w:w="100" w:type="dxa"/>
-              <w:bottom w:w="100" w:type="dxa"/>
-              <w:right w:w="100" w:type="dxa"/>
-            </w:tcMar>
-          </w:tcPr>
-          <w:p>
-            <w:pPr>
-              <w:widowControl w:val="0"/>
-              <w:pBdr>
-                <w:top w:val="nil"/>
-                <w:left w:val="nil"/>
-                <w:bottom w:val="nil"/>
-                <w:right w:val="nil"/>
-                <w:between w:val="nil"/>
-              </w:pBdr>
-            </w:pPr>
-          </w:p>
-        </w:tc>
-      </w:tr>
-      <w:tr>
-        <w:trPr>
-          <w:trHeight w:val="1575"/>
-        </w:trPr>
-        <w:tc>
-          <w:tcPr>
-            <w:tcW w:w="660" w:type="dxa"/>
-            <w:shd w:val="clear" w:color="auto" w:fill="auto"/>
-            <w:tcMar>
-              <w:top w:w="100" w:type="dxa"/>
-              <w:left w:w="100" w:type="dxa"/>
-              <w:bottom w:w="100" w:type="dxa"/>
-              <w:right w:w="100" w:type="dxa"/>
-            </w:tcMar>
-          </w:tcPr>
-          <w:p>
-            <w:pPr>
-              <w:widowControl w:val="0"/>
-              <w:pBdr>
-                <w:top w:val="nil"/>
-                <w:left w:val="nil"/>
-                <w:bottom w:val="nil"/>
-                <w:right w:val="nil"/>
-                <w:between w:val="nil"/>
-              </w:pBdr>
-            </w:pPr>
-          </w:p>
-        </w:tc>
-        <w:tc>
-          <w:tcPr>
-            <w:tcW w:w="1215" w:type="dxa"/>
-            <w:shd w:val="clear" w:color="auto" w:fill="auto"/>
-            <w:tcMar>
-              <w:top w:w="100" w:type="dxa"/>
-              <w:left w:w="100" w:type="dxa"/>
-              <w:bottom w:w="100" w:type="dxa"/>
-              <w:right w:w="100" w:type="dxa"/>
-            </w:tcMar>
-          </w:tcPr>
-          <w:p>
-            <w:pPr>
-              <w:widowControl w:val="0"/>
-              <w:pBdr>
-                <w:top w:val="nil"/>
-                <w:left w:val="nil"/>
-                <w:bottom w:val="nil"/>
-                <w:right w:val="nil"/>
-                <w:between w:val="nil"/>
-              </w:pBdr>
-            </w:pPr>
-            <w:r>
-              <w:t>Images</w:t>
-            </w:r>
-          </w:p>
-        </w:tc>
-        <w:tc>
-          <w:tcPr>
-            <w:tcW w:w="2505" w:type="dxa"/>
-            <w:shd w:val="clear" w:color="auto" w:fill="auto"/>
-            <w:tcMar>
-              <w:top w:w="100" w:type="dxa"/>
-              <w:left w:w="100" w:type="dxa"/>
-              <w:bottom w:w="100" w:type="dxa"/>
-              <w:right w:w="100" w:type="dxa"/>
-            </w:tcMar>
-          </w:tcPr>
-          <w:p>
-            <w:pPr>
-              <w:widowControl w:val="0"/>
-              <w:pBdr>
-                <w:top w:val="nil"/>
-                <w:left w:val="nil"/>
-                <w:bottom w:val="nil"/>
-                <w:right w:val="nil"/>
-                <w:between w:val="nil"/>
-              </w:pBdr>
-            </w:pPr>
-          </w:p>
-        </w:tc>
-        <w:tc>
-          <w:tcPr>
-            <w:tcW w:w="5565" w:type="dxa"/>
-            <w:shd w:val="clear" w:color="auto" w:fill="auto"/>
-            <w:tcMar>
-              <w:top w:w="100" w:type="dxa"/>
-              <w:left w:w="100" w:type="dxa"/>
-              <w:bottom w:w="100" w:type="dxa"/>
-              <w:right w:w="100" w:type="dxa"/>
-            </w:tcMar>
-          </w:tcPr>
-          <w:p>
-            <w:pPr>
-              <w:widowControl w:val="0"/>
-              <w:pBdr>
-                <w:top w:val="nil"/>
-                <w:left w:val="nil"/>
-                <w:bottom w:val="nil"/>
-                <w:right w:val="nil"/>
-                <w:between w:val="nil"/>
-              </w:pBdr>
-            </w:pPr>
-          </w:p>
-        </w:tc>
-      </w:tr>
-    </w:tbl>
     <w:p/>
     <w:p>
       <w:pPr>
@@ -6521,21 +5922,22 @@
           <w:bCs/>
         </w:rPr>
       </w:pPr>
-      <w:r>
+    </w:p>
+    <w:p>
+      <w:pPr>
         <w:rPr>
           <w:rFonts w:ascii="Arial" w:eastAsia="Arial" w:hAnsi="Arial" w:cs="Arial"/>
           <w:b/>
           <w:bCs/>
         </w:rPr>
-        <w:t xml:space="preserve">Trello </w:t>
-      </w:r>
+      </w:pPr>
       <w:r>
         <w:rPr>
           <w:rFonts w:ascii="Arial" w:eastAsia="Arial" w:hAnsi="Arial" w:cs="Arial"/>
           <w:b/>
           <w:bCs/>
         </w:rPr>
-        <w:t>–</w:t>
+        <w:t xml:space="preserve">Google Forms </w:t>
       </w:r>
       <w:r>
         <w:rPr>
@@ -6543,100 +5945,26 @@
           <w:b/>
           <w:bCs/>
         </w:rPr>
-        <w:t xml:space="preserve"> </w:t>
-      </w:r>
-      <w:r>
-        <w:rPr>
-          <w:rFonts w:ascii="Arial" w:eastAsia="Arial" w:hAnsi="Arial" w:cs="Arial"/>
-          <w:b/>
-          <w:bCs/>
-        </w:rPr>
-        <w:t>justification</w:t>
-      </w:r>
-    </w:p>
-    <w:p>
-      <w:pPr>
-        <w:rPr>
-          <w:rFonts w:ascii="Arial" w:eastAsia="Arial" w:hAnsi="Arial" w:cs="Arial"/>
-          <w:b/>
-          <w:bCs/>
-        </w:rPr>
-      </w:pPr>
-      <w:r>
-        <w:rPr>
-          <w:rFonts w:ascii="Arial" w:eastAsia="Arial" w:hAnsi="Arial" w:cs="Arial"/>
-          <w:b/>
-          <w:bCs/>
-        </w:rPr>
-        <w:t>I will use Trello as a sort of Shared Note board to keep track</w:t>
-      </w:r>
-      <w:r>
-        <w:rPr>
-          <w:rFonts w:ascii="Arial" w:eastAsia="Arial" w:hAnsi="Arial" w:cs="Arial"/>
-          <w:b/>
-          <w:bCs/>
-        </w:rPr>
-        <w:t xml:space="preserve"> of Goo</w:t>
-      </w:r>
-    </w:p>
-    <w:p>
-      <w:pPr>
-        <w:rPr>
-          <w:rFonts w:ascii="Arial" w:eastAsia="Arial" w:hAnsi="Arial" w:cs="Arial"/>
-          <w:b/>
-          <w:bCs/>
-        </w:rPr>
-      </w:pPr>
-    </w:p>
-    <w:p>
-      <w:pPr>
-        <w:rPr>
-          <w:rFonts w:ascii="Arial" w:eastAsia="Arial" w:hAnsi="Arial" w:cs="Arial"/>
-          <w:b/>
-          <w:bCs/>
-        </w:rPr>
-      </w:pPr>
-      <w:r>
-        <w:rPr>
-          <w:rFonts w:ascii="Arial" w:eastAsia="Arial" w:hAnsi="Arial" w:cs="Arial"/>
-          <w:b/>
-          <w:bCs/>
-        </w:rPr>
-        <w:t xml:space="preserve">Google Forms </w:t>
-      </w:r>
-      <w:r>
-        <w:rPr>
-          <w:rFonts w:ascii="Arial" w:eastAsia="Arial" w:hAnsi="Arial" w:cs="Arial"/>
-          <w:b/>
-          <w:bCs/>
-        </w:rPr>
-        <w:t xml:space="preserve">- </w:t>
-      </w:r>
-      <w:r>
-        <w:rPr>
-          <w:rFonts w:ascii="Arial" w:eastAsia="Arial" w:hAnsi="Arial" w:cs="Arial"/>
-          <w:b/>
-          <w:bCs/>
-        </w:rPr>
-        <w:t>justification</w:t>
-      </w:r>
-    </w:p>
-    <w:p>
-      <w:pPr>
-        <w:rPr>
-          <w:rFonts w:ascii="Arial" w:eastAsia="Arial" w:hAnsi="Arial" w:cs="Arial"/>
-          <w:color w:val="000000"/>
-          <w:sz w:val="24"/>
-          <w:szCs w:val="24"/>
-        </w:rPr>
-      </w:pPr>
-      <w:r>
-        <w:rPr>
-          <w:rFonts w:ascii="Arial" w:eastAsia="Arial" w:hAnsi="Arial" w:cs="Arial"/>
-          <w:color w:val="000000"/>
-          <w:sz w:val="24"/>
-          <w:szCs w:val="24"/>
-        </w:rPr>
+        <w:t>- justification</w:t>
+      </w:r>
+    </w:p>
+    <w:p>
+      <w:pPr>
+        <w:rPr>
+          <w:rFonts w:ascii="Arial" w:eastAsia="Arial" w:hAnsi="Arial" w:cs="Arial"/>
+          <w:color w:val="000000"/>
+          <w:sz w:val="24"/>
+          <w:szCs w:val="24"/>
+        </w:rPr>
+      </w:pPr>
+      <w:r>
+        <w:rPr>
+          <w:rFonts w:ascii="Arial" w:eastAsia="Arial" w:hAnsi="Arial" w:cs="Arial"/>
+          <w:color w:val="000000"/>
+          <w:sz w:val="24"/>
+          <w:szCs w:val="24"/>
+        </w:rPr>
+        <w:lastRenderedPageBreak/>
         <w:t xml:space="preserve">I will use Google Forms to receive feedback from users as I can freely share a </w:t>
       </w:r>
       <w:r>
@@ -6702,14 +6030,35 @@
           <w:iCs/>
         </w:rPr>
       </w:pPr>
-      <w:r>
-        <w:rPr>
-          <w:rFonts w:ascii="Arial" w:eastAsia="Arial" w:hAnsi="Arial" w:cs="Arial"/>
-          <w:i/>
-          <w:iCs/>
-        </w:rPr>
-        <w:t>(Add link here)</w:t>
-      </w:r>
+      <w:hyperlink r:id="rId17" w:history="1">
+        <w:r>
+          <w:rPr>
+            <w:rStyle w:val="Hyperlink"/>
+            <w:rFonts w:ascii="Arial" w:eastAsia="Arial" w:hAnsi="Arial" w:cs="Arial"/>
+            <w:i/>
+            <w:iCs/>
+          </w:rPr>
+          <w:t>(Add lin</w:t>
+        </w:r>
+        <w:r>
+          <w:rPr>
+            <w:rStyle w:val="Hyperlink"/>
+            <w:rFonts w:ascii="Arial" w:eastAsia="Arial" w:hAnsi="Arial" w:cs="Arial"/>
+            <w:i/>
+            <w:iCs/>
+          </w:rPr>
+          <w:t>k</w:t>
+        </w:r>
+        <w:r>
+          <w:rPr>
+            <w:rStyle w:val="Hyperlink"/>
+            <w:rFonts w:ascii="Arial" w:eastAsia="Arial" w:hAnsi="Arial" w:cs="Arial"/>
+            <w:i/>
+            <w:iCs/>
+          </w:rPr>
+          <w:t xml:space="preserve"> here)</w:t>
+        </w:r>
+      </w:hyperlink>
     </w:p>
     <w:p>
       <w:pPr>
@@ -6864,6 +6213,44 @@
       <w:pPr>
         <w:rPr>
           <w:rFonts w:ascii="Arial" w:eastAsia="Arial" w:hAnsi="Arial" w:cs="Arial"/>
+        </w:rPr>
+      </w:pPr>
+    </w:p>
+    <w:p>
+      <w:pPr>
+        <w:rPr>
+          <w:rFonts w:ascii="Arial" w:eastAsia="Arial" w:hAnsi="Arial" w:cs="Arial"/>
+        </w:rPr>
+      </w:pPr>
+      <w:r>
+        <w:rPr>
+          <w:rFonts w:ascii="Arial" w:eastAsia="Arial" w:hAnsi="Arial" w:cs="Arial"/>
+        </w:rPr>
+        <w:t xml:space="preserve">Link to my </w:t>
+      </w:r>
+      <w:hyperlink r:id="rId18" w:history="1">
+        <w:proofErr w:type="spellStart"/>
+        <w:r>
+          <w:rPr>
+            <w:rStyle w:val="Hyperlink"/>
+            <w:rFonts w:ascii="Arial" w:eastAsia="Arial" w:hAnsi="Arial" w:cs="Arial"/>
+          </w:rPr>
+          <w:t>Github</w:t>
+        </w:r>
+        <w:proofErr w:type="spellEnd"/>
+        <w:r>
+          <w:rPr>
+            <w:rStyle w:val="Hyperlink"/>
+            <w:rFonts w:ascii="Arial" w:eastAsia="Arial" w:hAnsi="Arial" w:cs="Arial"/>
+          </w:rPr>
+          <w:t xml:space="preserve"> Repo</w:t>
+        </w:r>
+      </w:hyperlink>
+    </w:p>
+    <w:p>
+      <w:pPr>
+        <w:rPr>
+          <w:rFonts w:ascii="Arial" w:eastAsia="Arial" w:hAnsi="Arial" w:cs="Arial"/>
           <w:color w:val="000000"/>
           <w:sz w:val="24"/>
           <w:szCs w:val="24"/>
@@ -7003,9 +6390,7 @@
           <w:szCs w:val="24"/>
         </w:rPr>
       </w:pPr>
-    </w:p>
-    <w:p>
-      <w:pPr>
+      <w:r>
         <w:rPr>
           <w:rFonts w:ascii="Arial" w:eastAsia="Arial" w:hAnsi="Arial" w:cs="Arial"/>
           <w:i/>
@@ -7014,7 +6399,42 @@
           <w:sz w:val="24"/>
           <w:szCs w:val="24"/>
         </w:rPr>
-      </w:pPr>
+        <w:drawing>
+          <wp:inline distT="0" distB="0" distL="0" distR="0" wp14:anchorId="3BA575F5" wp14:editId="19351115">
+            <wp:extent cx="5731510" cy="1503045"/>
+            <wp:effectExtent l="0" t="0" r="2540" b="1905"/>
+            <wp:docPr id="757444270" name="Picture 1" descr="A screenshot of a computer&#10;&#10;AI-generated content may be incorrect."/>
+            <wp:cNvGraphicFramePr>
+              <a:graphicFrameLocks xmlns:a="http://schemas.openxmlformats.org/drawingml/2006/main" noChangeAspect="1"/>
+            </wp:cNvGraphicFramePr>
+            <a:graphic xmlns:a="http://schemas.openxmlformats.org/drawingml/2006/main">
+              <a:graphicData uri="http://schemas.openxmlformats.org/drawingml/2006/picture">
+                <pic:pic xmlns:pic="http://schemas.openxmlformats.org/drawingml/2006/picture">
+                  <pic:nvPicPr>
+                    <pic:cNvPr id="757444270" name="Picture 1" descr="A screenshot of a computer&#10;&#10;AI-generated content may be incorrect."/>
+                    <pic:cNvPicPr/>
+                  </pic:nvPicPr>
+                  <pic:blipFill>
+                    <a:blip r:embed="rId19"/>
+                    <a:stretch>
+                      <a:fillRect/>
+                    </a:stretch>
+                  </pic:blipFill>
+                  <pic:spPr>
+                    <a:xfrm>
+                      <a:off x="0" y="0"/>
+                      <a:ext cx="5731510" cy="1503045"/>
+                    </a:xfrm>
+                    <a:prstGeom prst="rect">
+                      <a:avLst/>
+                    </a:prstGeom>
+                  </pic:spPr>
+                </pic:pic>
+              </a:graphicData>
+            </a:graphic>
+          </wp:inline>
+        </w:drawing>
+      </w:r>
     </w:p>
     <w:p>
       <w:pPr>
@@ -7039,6 +6459,291 @@
           <w:szCs w:val="24"/>
         </w:rPr>
       </w:pPr>
+    </w:p>
+    <w:p>
+      <w:pPr>
+        <w:rPr>
+          <w:rFonts w:ascii="Arial" w:eastAsia="Arial" w:hAnsi="Arial" w:cs="Arial"/>
+          <w:i/>
+          <w:iCs/>
+          <w:color w:val="000000"/>
+          <w:sz w:val="24"/>
+          <w:szCs w:val="24"/>
+        </w:rPr>
+      </w:pPr>
+    </w:p>
+    <w:p>
+      <w:pPr>
+        <w:rPr>
+          <w:rFonts w:ascii="Arial" w:eastAsia="Arial" w:hAnsi="Arial" w:cs="Arial"/>
+          <w:i/>
+          <w:iCs/>
+          <w:color w:val="000000"/>
+          <w:sz w:val="24"/>
+          <w:szCs w:val="24"/>
+        </w:rPr>
+      </w:pPr>
+    </w:p>
+    <w:p>
+      <w:pPr>
+        <w:rPr>
+          <w:rFonts w:ascii="Arial" w:eastAsia="Arial" w:hAnsi="Arial" w:cs="Arial"/>
+          <w:i/>
+          <w:iCs/>
+          <w:color w:val="000000"/>
+          <w:sz w:val="24"/>
+          <w:szCs w:val="24"/>
+        </w:rPr>
+      </w:pPr>
+    </w:p>
+    <w:p>
+      <w:pPr>
+        <w:rPr>
+          <w:rFonts w:ascii="Arial" w:eastAsia="Arial" w:hAnsi="Arial" w:cs="Arial"/>
+          <w:i/>
+          <w:iCs/>
+          <w:color w:val="000000"/>
+          <w:sz w:val="24"/>
+          <w:szCs w:val="24"/>
+        </w:rPr>
+      </w:pPr>
+    </w:p>
+    <w:p>
+      <w:pPr>
+        <w:rPr>
+          <w:rFonts w:ascii="Arial" w:eastAsia="Arial" w:hAnsi="Arial" w:cs="Arial"/>
+          <w:i/>
+          <w:iCs/>
+          <w:color w:val="000000"/>
+          <w:sz w:val="24"/>
+          <w:szCs w:val="24"/>
+        </w:rPr>
+      </w:pPr>
+    </w:p>
+    <w:p>
+      <w:pPr>
+        <w:rPr>
+          <w:rFonts w:ascii="Arial" w:eastAsia="Arial" w:hAnsi="Arial" w:cs="Arial"/>
+          <w:i/>
+          <w:iCs/>
+          <w:color w:val="000000"/>
+          <w:sz w:val="24"/>
+          <w:szCs w:val="24"/>
+        </w:rPr>
+      </w:pPr>
+    </w:p>
+    <w:p>
+      <w:pPr>
+        <w:rPr>
+          <w:rFonts w:ascii="Arial" w:eastAsia="Arial" w:hAnsi="Arial" w:cs="Arial"/>
+          <w:i/>
+          <w:iCs/>
+          <w:color w:val="000000"/>
+          <w:sz w:val="24"/>
+          <w:szCs w:val="24"/>
+        </w:rPr>
+      </w:pPr>
+    </w:p>
+    <w:p>
+      <w:pPr>
+        <w:rPr>
+          <w:rFonts w:ascii="Arial" w:eastAsia="Arial" w:hAnsi="Arial" w:cs="Arial"/>
+          <w:i/>
+          <w:iCs/>
+          <w:color w:val="000000"/>
+          <w:sz w:val="24"/>
+          <w:szCs w:val="24"/>
+        </w:rPr>
+      </w:pPr>
+    </w:p>
+    <w:p>
+      <w:pPr>
+        <w:rPr>
+          <w:rFonts w:ascii="Arial" w:eastAsia="Arial" w:hAnsi="Arial" w:cs="Arial"/>
+          <w:i/>
+          <w:iCs/>
+          <w:color w:val="000000"/>
+          <w:sz w:val="24"/>
+          <w:szCs w:val="24"/>
+        </w:rPr>
+      </w:pPr>
+    </w:p>
+    <w:p>
+      <w:pPr>
+        <w:rPr>
+          <w:rFonts w:ascii="Arial" w:eastAsia="Arial" w:hAnsi="Arial" w:cs="Arial"/>
+          <w:i/>
+          <w:iCs/>
+          <w:color w:val="000000"/>
+          <w:sz w:val="24"/>
+          <w:szCs w:val="24"/>
+        </w:rPr>
+      </w:pPr>
+    </w:p>
+    <w:p>
+      <w:pPr>
+        <w:rPr>
+          <w:rFonts w:ascii="Arial" w:eastAsia="Arial" w:hAnsi="Arial" w:cs="Arial"/>
+          <w:i/>
+          <w:iCs/>
+          <w:color w:val="000000"/>
+          <w:sz w:val="24"/>
+          <w:szCs w:val="24"/>
+        </w:rPr>
+      </w:pPr>
+    </w:p>
+    <w:p>
+      <w:pPr>
+        <w:rPr>
+          <w:rFonts w:ascii="Arial" w:eastAsia="Arial" w:hAnsi="Arial" w:cs="Arial"/>
+          <w:i/>
+          <w:iCs/>
+          <w:color w:val="000000"/>
+          <w:sz w:val="24"/>
+          <w:szCs w:val="24"/>
+        </w:rPr>
+      </w:pPr>
+    </w:p>
+    <w:p>
+      <w:pPr>
+        <w:rPr>
+          <w:rFonts w:ascii="Arial" w:eastAsia="Arial" w:hAnsi="Arial" w:cs="Arial"/>
+          <w:i/>
+          <w:iCs/>
+          <w:color w:val="000000"/>
+          <w:sz w:val="24"/>
+          <w:szCs w:val="24"/>
+        </w:rPr>
+      </w:pPr>
+    </w:p>
+    <w:p>
+      <w:pPr>
+        <w:rPr>
+          <w:rFonts w:ascii="Arial" w:eastAsia="Arial" w:hAnsi="Arial" w:cs="Arial"/>
+          <w:i/>
+          <w:iCs/>
+          <w:color w:val="000000"/>
+          <w:sz w:val="24"/>
+          <w:szCs w:val="24"/>
+        </w:rPr>
+      </w:pPr>
+    </w:p>
+    <w:p>
+      <w:pPr>
+        <w:rPr>
+          <w:rFonts w:ascii="Arial" w:eastAsia="Arial" w:hAnsi="Arial" w:cs="Arial"/>
+          <w:i/>
+          <w:iCs/>
+          <w:color w:val="000000"/>
+          <w:sz w:val="24"/>
+          <w:szCs w:val="24"/>
+        </w:rPr>
+      </w:pPr>
+    </w:p>
+    <w:p>
+      <w:pPr>
+        <w:rPr>
+          <w:rFonts w:ascii="Arial" w:eastAsia="Arial" w:hAnsi="Arial" w:cs="Arial"/>
+          <w:i/>
+          <w:iCs/>
+          <w:color w:val="000000"/>
+          <w:sz w:val="24"/>
+          <w:szCs w:val="24"/>
+        </w:rPr>
+      </w:pPr>
+    </w:p>
+    <w:p>
+      <w:pPr>
+        <w:rPr>
+          <w:rFonts w:ascii="Arial" w:eastAsia="Arial" w:hAnsi="Arial" w:cs="Arial"/>
+          <w:i/>
+          <w:iCs/>
+          <w:color w:val="000000"/>
+          <w:sz w:val="24"/>
+          <w:szCs w:val="24"/>
+        </w:rPr>
+      </w:pPr>
+    </w:p>
+    <w:p>
+      <w:pPr>
+        <w:rPr>
+          <w:rFonts w:ascii="Arial" w:eastAsia="Arial" w:hAnsi="Arial" w:cs="Arial"/>
+          <w:b/>
+          <w:bCs/>
+          <w:color w:val="000000"/>
+          <w:sz w:val="48"/>
+          <w:szCs w:val="48"/>
+        </w:rPr>
+      </w:pPr>
+      <w:r>
+        <w:rPr>
+          <w:rFonts w:ascii="Arial" w:eastAsia="Arial" w:hAnsi="Arial" w:cs="Arial"/>
+          <w:b/>
+          <w:bCs/>
+          <w:color w:val="000000"/>
+          <w:sz w:val="48"/>
+          <w:szCs w:val="48"/>
+        </w:rPr>
+        <w:lastRenderedPageBreak/>
+        <w:t>First Pull Request</w:t>
+      </w:r>
+    </w:p>
+    <w:p>
+      <w:pPr>
+        <w:rPr>
+          <w:rFonts w:ascii="Arial" w:eastAsia="Arial" w:hAnsi="Arial" w:cs="Arial"/>
+          <w:i/>
+          <w:iCs/>
+          <w:color w:val="000000"/>
+          <w:sz w:val="24"/>
+          <w:szCs w:val="24"/>
+        </w:rPr>
+      </w:pPr>
+      <w:r>
+        <w:rPr>
+          <w:rFonts w:ascii="Arial" w:eastAsia="Arial" w:hAnsi="Arial" w:cs="Arial"/>
+          <w:i/>
+          <w:iCs/>
+          <w:color w:val="000000"/>
+          <w:sz w:val="24"/>
+          <w:szCs w:val="24"/>
+        </w:rPr>
+        <w:drawing>
+          <wp:inline distT="0" distB="0" distL="0" distR="0" wp14:anchorId="69660E0C" wp14:editId="2F98DF49">
+            <wp:extent cx="5731510" cy="6828155"/>
+            <wp:effectExtent l="0" t="0" r="2540" b="0"/>
+            <wp:docPr id="1168326969" name="Picture 1" descr="A screenshot of a computer&#10;&#10;AI-generated content may be incorrect."/>
+            <wp:cNvGraphicFramePr>
+              <a:graphicFrameLocks xmlns:a="http://schemas.openxmlformats.org/drawingml/2006/main" noChangeAspect="1"/>
+            </wp:cNvGraphicFramePr>
+            <a:graphic xmlns:a="http://schemas.openxmlformats.org/drawingml/2006/main">
+              <a:graphicData uri="http://schemas.openxmlformats.org/drawingml/2006/picture">
+                <pic:pic xmlns:pic="http://schemas.openxmlformats.org/drawingml/2006/picture">
+                  <pic:nvPicPr>
+                    <pic:cNvPr id="1168326969" name="Picture 1" descr="A screenshot of a computer&#10;&#10;AI-generated content may be incorrect."/>
+                    <pic:cNvPicPr/>
+                  </pic:nvPicPr>
+                  <pic:blipFill>
+                    <a:blip r:embed="rId20"/>
+                    <a:stretch>
+                      <a:fillRect/>
+                    </a:stretch>
+                  </pic:blipFill>
+                  <pic:spPr>
+                    <a:xfrm>
+                      <a:off x="0" y="0"/>
+                      <a:ext cx="5731510" cy="6828155"/>
+                    </a:xfrm>
+                    <a:prstGeom prst="rect">
+                      <a:avLst/>
+                    </a:prstGeom>
+                  </pic:spPr>
+                </pic:pic>
+              </a:graphicData>
+            </a:graphic>
+          </wp:inline>
+        </w:drawing>
+      </w:r>
     </w:p>
     <w:p>
       <w:pPr>
@@ -7127,7 +6832,17 @@
                 <w:lang w:eastAsia="en-NZ"/>
               </w:rPr>
               <w:lastRenderedPageBreak/>
-              <w:t>Component 1: (STATE WHAT IS YOUR CHOSEN COMPONENT HERE)</w:t>
+              <w:t xml:space="preserve">Component 1: </w:t>
+            </w:r>
+            <w:r>
+              <w:rPr>
+                <w:rFonts w:ascii="Arial" w:eastAsia="Arial" w:hAnsi="Arial" w:cs="Arial"/>
+                <w:color w:val="000000"/>
+                <w:sz w:val="24"/>
+                <w:szCs w:val="24"/>
+                <w:lang w:eastAsia="en-NZ"/>
+              </w:rPr>
+              <w:t>Colour Scheme</w:t>
             </w:r>
           </w:p>
         </w:tc>
@@ -7154,6 +6869,7 @@
                 <w:shd w:val="clear" w:color="auto" w:fill="FFFFFF"/>
               </w:rPr>
             </w:pPr>
+            <w:proofErr w:type="gramStart"/>
             <w:r>
               <w:rPr>
                 <w:rFonts w:ascii="Arial" w:eastAsia="Arial" w:hAnsi="Arial" w:cs="Arial"/>
@@ -7184,6 +6900,7 @@
               </w:rPr>
               <w:t>:</w:t>
             </w:r>
+            <w:proofErr w:type="gramEnd"/>
             <w:r>
               <w:rPr>
                 <w:rFonts w:ascii="Arial" w:hAnsi="Arial" w:cs="Arial"/>
@@ -7191,6 +6908,39 @@
                 <w:shd w:val="clear" w:color="auto" w:fill="FFFFFF"/>
               </w:rPr>
               <w:t xml:space="preserve"> </w:t>
+            </w:r>
+            <w:r>
+              <w:rPr>
+                <w:rFonts w:ascii="Arial" w:hAnsi="Arial" w:cs="Arial"/>
+                <w:color w:val="000000"/>
+                <w:shd w:val="clear" w:color="auto" w:fill="FFFFFF"/>
+              </w:rPr>
+              <w:t>The change I was trialling was the colour</w:t>
+            </w:r>
+            <w:r>
+              <w:rPr>
+                <w:rFonts w:ascii="Arial" w:hAnsi="Arial" w:cs="Arial"/>
+                <w:color w:val="000000"/>
+                <w:shd w:val="clear" w:color="auto" w:fill="FFFFFF"/>
+              </w:rPr>
+              <w:t>/theme of my application to see what potential users may or may not like/enjoy when using the application.</w:t>
+            </w:r>
+          </w:p>
+          <w:p>
+            <w:pPr>
+              <w:rPr>
+                <w:rFonts w:ascii="Arial" w:hAnsi="Arial" w:cs="Arial"/>
+                <w:color w:val="000000"/>
+                <w:shd w:val="clear" w:color="auto" w:fill="FFFFFF"/>
+              </w:rPr>
+            </w:pPr>
+            <w:r>
+              <w:rPr>
+                <w:rFonts w:ascii="Arial" w:hAnsi="Arial" w:cs="Arial"/>
+                <w:color w:val="000000"/>
+                <w:shd w:val="clear" w:color="auto" w:fill="FFFFFF"/>
+              </w:rPr>
+              <w:t>(A, B, C are left to right respectively)</w:t>
             </w:r>
           </w:p>
         </w:tc>
@@ -7208,9 +6958,7 @@
                 <w:lang w:eastAsia="en-NZ"/>
               </w:rPr>
             </w:pPr>
-          </w:p>
-          <w:p>
-            <w:pPr>
+            <w:r>
               <w:rPr>
                 <w:rFonts w:ascii="Arial" w:eastAsia="Arial" w:hAnsi="Arial" w:cs="Arial"/>
                 <w:color w:val="000000"/>
@@ -7218,120 +6966,42 @@
                 <w:szCs w:val="24"/>
                 <w:lang w:eastAsia="en-NZ"/>
               </w:rPr>
-            </w:pPr>
-            <w:r>
-              <w:rPr>
-                <w:rFonts w:ascii="Arial" w:eastAsia="Arial" w:hAnsi="Arial" w:cs="Arial"/>
-                <w:color w:val="000000"/>
-                <w:sz w:val="24"/>
-                <w:szCs w:val="24"/>
-                <w:lang w:eastAsia="en-NZ"/>
-              </w:rPr>
-              <w:t xml:space="preserve">(Snip 3 to 4 different component concepts of your GUI’s component you are trialling here. e.g. </w:t>
-            </w:r>
-            <w:r>
-              <w:rPr>
-                <w:rFonts w:ascii="Arial" w:eastAsia="Arial" w:hAnsi="Arial" w:cs="Arial"/>
-                <w:color w:val="000000"/>
-                <w:sz w:val="24"/>
-                <w:szCs w:val="24"/>
-                <w:lang w:eastAsia="en-NZ"/>
-              </w:rPr>
-              <w:t>I</w:t>
-            </w:r>
-            <w:r>
-              <w:rPr>
-                <w:rFonts w:ascii="Arial" w:eastAsia="Arial" w:hAnsi="Arial" w:cs="Arial"/>
-                <w:color w:val="000000"/>
-                <w:sz w:val="24"/>
-                <w:szCs w:val="24"/>
-                <w:lang w:eastAsia="en-NZ"/>
-              </w:rPr>
-              <w:t>f you are trialling functional component such as list</w:t>
-            </w:r>
-            <w:r>
-              <w:rPr>
-                <w:rFonts w:ascii="Arial" w:eastAsia="Arial" w:hAnsi="Arial" w:cs="Arial"/>
-                <w:color w:val="000000"/>
-                <w:sz w:val="24"/>
-                <w:szCs w:val="24"/>
-                <w:lang w:eastAsia="en-NZ"/>
-              </w:rPr>
-              <w:t xml:space="preserve"> vs</w:t>
-            </w:r>
-            <w:r>
-              <w:rPr>
-                <w:rFonts w:ascii="Arial" w:eastAsia="Arial" w:hAnsi="Arial" w:cs="Arial"/>
-                <w:color w:val="000000"/>
-                <w:sz w:val="24"/>
-                <w:szCs w:val="24"/>
-                <w:lang w:eastAsia="en-NZ"/>
-              </w:rPr>
-              <w:t xml:space="preserve"> radio</w:t>
-            </w:r>
-            <w:r>
-              <w:rPr>
-                <w:rFonts w:ascii="Arial" w:eastAsia="Arial" w:hAnsi="Arial" w:cs="Arial"/>
-                <w:color w:val="000000"/>
-                <w:sz w:val="24"/>
-                <w:szCs w:val="24"/>
-                <w:lang w:eastAsia="en-NZ"/>
-              </w:rPr>
-              <w:t xml:space="preserve"> </w:t>
-            </w:r>
-            <w:r>
-              <w:rPr>
-                <w:rFonts w:ascii="Arial" w:eastAsia="Arial" w:hAnsi="Arial" w:cs="Arial"/>
-                <w:color w:val="000000"/>
-                <w:sz w:val="24"/>
-                <w:szCs w:val="24"/>
-                <w:lang w:eastAsia="en-NZ"/>
-              </w:rPr>
-              <w:t>buttons etc</w:t>
-            </w:r>
-            <w:r>
-              <w:rPr>
-                <w:rFonts w:ascii="Arial" w:eastAsia="Arial" w:hAnsi="Arial" w:cs="Arial"/>
-                <w:color w:val="000000"/>
-                <w:sz w:val="24"/>
-                <w:szCs w:val="24"/>
-                <w:lang w:eastAsia="en-NZ"/>
-              </w:rPr>
-              <w:t>)</w:t>
-            </w:r>
-          </w:p>
-          <w:p>
-            <w:pPr>
-              <w:rPr>
-                <w:rFonts w:ascii="Arial" w:eastAsia="Arial" w:hAnsi="Arial" w:cs="Arial"/>
-                <w:color w:val="000000"/>
-                <w:sz w:val="24"/>
-                <w:szCs w:val="24"/>
-                <w:lang w:eastAsia="en-NZ"/>
-              </w:rPr>
-            </w:pPr>
-          </w:p>
-          <w:p>
-            <w:pPr>
-              <w:rPr>
-                <w:rFonts w:ascii="Arial" w:eastAsia="Arial" w:hAnsi="Arial" w:cs="Arial"/>
-                <w:color w:val="000000"/>
-                <w:sz w:val="24"/>
-                <w:szCs w:val="24"/>
-                <w:lang w:eastAsia="en-NZ"/>
-              </w:rPr>
-            </w:pPr>
-          </w:p>
-          <w:p>
-            <w:pPr>
-              <w:rPr>
-                <w:rFonts w:ascii="Arial" w:eastAsia="Arial" w:hAnsi="Arial" w:cs="Arial"/>
-                <w:color w:val="000000"/>
-                <w:sz w:val="24"/>
-                <w:szCs w:val="24"/>
-                <w:lang w:eastAsia="en-NZ"/>
-              </w:rPr>
-            </w:pPr>
+              <w:drawing>
+                <wp:inline distT="0" distB="0" distL="0" distR="0" wp14:anchorId="6A374325" wp14:editId="20F314AF">
+                  <wp:extent cx="6544588" cy="2457793"/>
+                  <wp:effectExtent l="0" t="0" r="8890" b="0"/>
+                  <wp:docPr id="717474321" name="Picture 1"/>
+                  <wp:cNvGraphicFramePr>
+                    <a:graphicFrameLocks xmlns:a="http://schemas.openxmlformats.org/drawingml/2006/main" noChangeAspect="1"/>
+                  </wp:cNvGraphicFramePr>
+                  <a:graphic xmlns:a="http://schemas.openxmlformats.org/drawingml/2006/main">
+                    <a:graphicData uri="http://schemas.openxmlformats.org/drawingml/2006/picture">
+                      <pic:pic xmlns:pic="http://schemas.openxmlformats.org/drawingml/2006/picture">
+                        <pic:nvPicPr>
+                          <pic:cNvPr id="717474321" name=""/>
+                          <pic:cNvPicPr/>
+                        </pic:nvPicPr>
+                        <pic:blipFill>
+                          <a:blip r:embed="rId21"/>
+                          <a:stretch>
+                            <a:fillRect/>
+                          </a:stretch>
+                        </pic:blipFill>
+                        <pic:spPr>
+                          <a:xfrm>
+                            <a:off x="0" y="0"/>
+                            <a:ext cx="6544588" cy="2457793"/>
+                          </a:xfrm>
+                          <a:prstGeom prst="rect">
+                            <a:avLst/>
+                          </a:prstGeom>
+                        </pic:spPr>
+                      </pic:pic>
+                    </a:graphicData>
+                  </a:graphic>
+                </wp:inline>
+              </w:drawing>
+            </w:r>
           </w:p>
         </w:tc>
       </w:tr>
@@ -7382,11 +7052,65 @@
                 <w:szCs w:val="24"/>
                 <w:lang w:eastAsia="en-NZ"/>
               </w:rPr>
-              <w:t xml:space="preserve">(Add snip of results/feedback or recordings here, this could be a pie graph of results or logs of responses, the more feedback the better) </w:t>
-            </w:r>
-          </w:p>
-          <w:p>
-            <w:pPr>
+              <w:drawing>
+                <wp:anchor distT="0" distB="0" distL="114300" distR="114300" simplePos="0" relativeHeight="251658240" behindDoc="0" locked="0" layoutInCell="1" allowOverlap="1" wp14:anchorId="64AEB73E" wp14:editId="13C8E3E1">
+                  <wp:simplePos x="0" y="0"/>
+                  <wp:positionH relativeFrom="column">
+                    <wp:posOffset>3629660</wp:posOffset>
+                  </wp:positionH>
+                  <wp:positionV relativeFrom="paragraph">
+                    <wp:posOffset>57785</wp:posOffset>
+                  </wp:positionV>
+                  <wp:extent cx="3371850" cy="1777365"/>
+                  <wp:effectExtent l="0" t="0" r="0" b="0"/>
+                  <wp:wrapThrough wrapText="bothSides">
+                    <wp:wrapPolygon edited="0">
+                      <wp:start x="0" y="0"/>
+                      <wp:lineTo x="0" y="21299"/>
+                      <wp:lineTo x="21478" y="21299"/>
+                      <wp:lineTo x="21478" y="0"/>
+                      <wp:lineTo x="0" y="0"/>
+                    </wp:wrapPolygon>
+                  </wp:wrapThrough>
+                  <wp:docPr id="1875680645" name="Picture 1"/>
+                  <wp:cNvGraphicFramePr>
+                    <a:graphicFrameLocks xmlns:a="http://schemas.openxmlformats.org/drawingml/2006/main" noChangeAspect="1"/>
+                  </wp:cNvGraphicFramePr>
+                  <a:graphic xmlns:a="http://schemas.openxmlformats.org/drawingml/2006/main">
+                    <a:graphicData uri="http://schemas.openxmlformats.org/drawingml/2006/picture">
+                      <pic:pic xmlns:pic="http://schemas.openxmlformats.org/drawingml/2006/picture">
+                        <pic:nvPicPr>
+                          <pic:cNvPr id="1875680645" name=""/>
+                          <pic:cNvPicPr/>
+                        </pic:nvPicPr>
+                        <pic:blipFill>
+                          <a:blip r:embed="rId22">
+                            <a:extLst>
+                              <a:ext uri="{28A0092B-C50C-407E-A947-70E740481C1C}">
+                                <a14:useLocalDpi xmlns:a14="http://schemas.microsoft.com/office/drawing/2010/main" val="0"/>
+                              </a:ext>
+                            </a:extLst>
+                          </a:blip>
+                          <a:stretch>
+                            <a:fillRect/>
+                          </a:stretch>
+                        </pic:blipFill>
+                        <pic:spPr>
+                          <a:xfrm>
+                            <a:off x="0" y="0"/>
+                            <a:ext cx="3371850" cy="1777365"/>
+                          </a:xfrm>
+                          <a:prstGeom prst="rect">
+                            <a:avLst/>
+                          </a:prstGeom>
+                        </pic:spPr>
+                      </pic:pic>
+                    </a:graphicData>
+                  </a:graphic>
+                </wp:anchor>
+              </w:drawing>
+            </w:r>
+            <w:r>
               <w:rPr>
                 <w:rFonts w:ascii="Arial" w:eastAsia="Arial" w:hAnsi="Arial" w:cs="Arial"/>
                 <w:color w:val="000000"/>
@@ -7394,10 +7118,9 @@
                 <w:szCs w:val="24"/>
                 <w:lang w:eastAsia="en-NZ"/>
               </w:rPr>
-            </w:pPr>
-          </w:p>
-          <w:p>
-            <w:pPr>
+              <w:t>Out of</w:t>
+            </w:r>
+            <w:r>
               <w:rPr>
                 <w:rFonts w:ascii="Arial" w:eastAsia="Arial" w:hAnsi="Arial" w:cs="Arial"/>
                 <w:color w:val="000000"/>
@@ -7405,7 +7128,8 @@
                 <w:szCs w:val="24"/>
                 <w:lang w:eastAsia="en-NZ"/>
               </w:rPr>
-            </w:pPr>
+              <w:t xml:space="preserve"> each of the choices variant B was the least liked out of the three</w:t>
+            </w:r>
             <w:r>
               <w:rPr>
                 <w:rFonts w:ascii="Arial" w:eastAsia="Arial" w:hAnsi="Arial" w:cs="Arial"/>
@@ -7414,11 +7138,9 @@
                 <w:szCs w:val="24"/>
                 <w:lang w:eastAsia="en-NZ"/>
               </w:rPr>
-              <w:t>(Add your evaluation of the responses here)</w:t>
-            </w:r>
-          </w:p>
-          <w:p>
-            <w:pPr>
+              <w:t>, with many users complaining about the colour scheme being too dark to easily use.</w:t>
+            </w:r>
+            <w:r>
               <w:rPr>
                 <w:rFonts w:ascii="Arial" w:eastAsia="Arial" w:hAnsi="Arial" w:cs="Arial"/>
                 <w:color w:val="000000"/>
@@ -7426,10 +7148,9 @@
                 <w:szCs w:val="24"/>
                 <w:lang w:eastAsia="en-NZ"/>
               </w:rPr>
-            </w:pPr>
-          </w:p>
-          <w:p>
-            <w:pPr>
+              <w:t xml:space="preserve"> Variant C was</w:t>
+            </w:r>
+            <w:r>
               <w:rPr>
                 <w:rFonts w:ascii="Arial" w:eastAsia="Arial" w:hAnsi="Arial" w:cs="Arial"/>
                 <w:color w:val="000000"/>
@@ -7437,7 +7158,72 @@
                 <w:szCs w:val="24"/>
                 <w:lang w:eastAsia="en-NZ"/>
               </w:rPr>
-            </w:pPr>
+              <w:t xml:space="preserve"> perceived much more positively than variant B, </w:t>
+            </w:r>
+            <w:r>
+              <w:rPr>
+                <w:rFonts w:ascii="Arial" w:eastAsia="Arial" w:hAnsi="Arial" w:cs="Arial"/>
+                <w:color w:val="000000"/>
+                <w:sz w:val="24"/>
+                <w:szCs w:val="24"/>
+                <w:lang w:eastAsia="en-NZ"/>
+              </w:rPr>
+              <w:t xml:space="preserve">and while it doesn’t take the first spot of which variant was most liked, it seemed to have a few users who preferred it vastly more </w:t>
+            </w:r>
+            <w:proofErr w:type="spellStart"/>
+            <w:r>
+              <w:rPr>
+                <w:rFonts w:ascii="Arial" w:eastAsia="Arial" w:hAnsi="Arial" w:cs="Arial"/>
+                <w:color w:val="000000"/>
+                <w:sz w:val="24"/>
+                <w:szCs w:val="24"/>
+                <w:lang w:eastAsia="en-NZ"/>
+              </w:rPr>
+              <w:t>then</w:t>
+            </w:r>
+            <w:proofErr w:type="spellEnd"/>
+            <w:r>
+              <w:rPr>
+                <w:rFonts w:ascii="Arial" w:eastAsia="Arial" w:hAnsi="Arial" w:cs="Arial"/>
+                <w:color w:val="000000"/>
+                <w:sz w:val="24"/>
+                <w:szCs w:val="24"/>
+                <w:lang w:eastAsia="en-NZ"/>
+              </w:rPr>
+              <w:t xml:space="preserve"> other users. the Variant A was the most well received variant with </w:t>
+            </w:r>
+            <w:proofErr w:type="gramStart"/>
+            <w:r>
+              <w:rPr>
+                <w:rFonts w:ascii="Arial" w:eastAsia="Arial" w:hAnsi="Arial" w:cs="Arial"/>
+                <w:color w:val="000000"/>
+                <w:sz w:val="24"/>
+                <w:szCs w:val="24"/>
+                <w:lang w:eastAsia="en-NZ"/>
+              </w:rPr>
+              <w:t>a majority of</w:t>
+            </w:r>
+            <w:proofErr w:type="gramEnd"/>
+            <w:r>
+              <w:rPr>
+                <w:rFonts w:ascii="Arial" w:eastAsia="Arial" w:hAnsi="Arial" w:cs="Arial"/>
+                <w:color w:val="000000"/>
+                <w:sz w:val="24"/>
+                <w:szCs w:val="24"/>
+                <w:lang w:eastAsia="en-NZ"/>
+              </w:rPr>
+              <w:t xml:space="preserve"> users liking the contrasted buttons </w:t>
+            </w:r>
+            <w:r>
+              <w:rPr>
+                <w:rFonts w:ascii="Arial" w:eastAsia="Arial" w:hAnsi="Arial" w:cs="Arial"/>
+                <w:color w:val="000000"/>
+                <w:sz w:val="24"/>
+                <w:szCs w:val="24"/>
+                <w:lang w:eastAsia="en-NZ"/>
+              </w:rPr>
+              <w:t>and the rainbow gradient of colours for each item.</w:t>
+            </w:r>
           </w:p>
         </w:tc>
       </w:tr>
@@ -7482,6 +7268,48 @@
                 <w:lang w:eastAsia="en-NZ"/>
               </w:rPr>
             </w:pPr>
+            <w:r>
+              <w:rPr>
+                <w:rFonts w:ascii="Arial" w:eastAsia="Arial" w:hAnsi="Arial" w:cs="Arial"/>
+                <w:color w:val="000000"/>
+                <w:sz w:val="24"/>
+                <w:szCs w:val="24"/>
+                <w:lang w:eastAsia="en-NZ"/>
+              </w:rPr>
+              <w:t xml:space="preserve">I have chosen the colour scheme in variant A, this is because along with being the least negatively responded too, it also allows for </w:t>
+            </w:r>
+            <w:r>
+              <w:rPr>
+                <w:rFonts w:ascii="Arial" w:eastAsia="Arial" w:hAnsi="Arial" w:cs="Arial"/>
+                <w:color w:val="000000"/>
+                <w:sz w:val="24"/>
+                <w:szCs w:val="24"/>
+                <w:lang w:eastAsia="en-NZ"/>
+              </w:rPr>
+              <w:t xml:space="preserve">a lot more freedom in changes that may </w:t>
+            </w:r>
+            <w:proofErr w:type="gramStart"/>
+            <w:r>
+              <w:rPr>
+                <w:rFonts w:ascii="Arial" w:eastAsia="Arial" w:hAnsi="Arial" w:cs="Arial"/>
+                <w:color w:val="000000"/>
+                <w:sz w:val="24"/>
+                <w:szCs w:val="24"/>
+                <w:lang w:eastAsia="en-NZ"/>
+              </w:rPr>
+              <w:t>come in the future</w:t>
+            </w:r>
+            <w:proofErr w:type="gramEnd"/>
+            <w:r>
+              <w:rPr>
+                <w:rFonts w:ascii="Arial" w:eastAsia="Arial" w:hAnsi="Arial" w:cs="Arial"/>
+                <w:color w:val="000000"/>
+                <w:sz w:val="24"/>
+                <w:szCs w:val="24"/>
+                <w:lang w:eastAsia="en-NZ"/>
+              </w:rPr>
+              <w:t xml:space="preserve"> if I decide to allow for the colour scheme to be changed by the users.</w:t>
+            </w:r>
           </w:p>
         </w:tc>
       </w:tr>
@@ -7507,8 +7335,8 @@
         <w:tblLook w:val="04A0" w:firstRow="1" w:lastRow="0" w:firstColumn="1" w:lastColumn="0" w:noHBand="0" w:noVBand="1"/>
       </w:tblPr>
       <w:tblGrid>
-        <w:gridCol w:w="2830"/>
-        <w:gridCol w:w="11199"/>
+        <w:gridCol w:w="2173"/>
+        <w:gridCol w:w="11856"/>
       </w:tblGrid>
       <w:tr>
         <w:tc>
@@ -7534,7 +7362,17 @@
                 <w:szCs w:val="24"/>
                 <w:lang w:eastAsia="en-NZ"/>
               </w:rPr>
-              <w:t>Component 2: (STATE WHAT IS YOUR CHOSEN COMPONENT HERE)</w:t>
+              <w:t xml:space="preserve">Component 2: </w:t>
+            </w:r>
+            <w:r>
+              <w:rPr>
+                <w:rFonts w:ascii="Arial" w:eastAsia="Arial" w:hAnsi="Arial" w:cs="Arial"/>
+                <w:color w:val="000000"/>
+                <w:sz w:val="24"/>
+                <w:szCs w:val="24"/>
+                <w:lang w:eastAsia="en-NZ"/>
+              </w:rPr>
+              <w:t>Differing layout for Returns UI</w:t>
             </w:r>
           </w:p>
         </w:tc>
@@ -7591,9 +7429,7 @@
                 <w:lang w:eastAsia="en-NZ"/>
               </w:rPr>
             </w:pPr>
-          </w:p>
-          <w:p>
-            <w:pPr>
+            <w:r>
               <w:rPr>
                 <w:rFonts w:ascii="Arial" w:eastAsia="Arial" w:hAnsi="Arial" w:cs="Arial"/>
                 <w:color w:val="000000"/>
@@ -7601,81 +7437,42 @@
                 <w:szCs w:val="24"/>
                 <w:lang w:eastAsia="en-NZ"/>
               </w:rPr>
-            </w:pPr>
-          </w:p>
-          <w:p>
-            <w:pPr>
-              <w:rPr>
-                <w:rFonts w:ascii="Arial" w:eastAsia="Arial" w:hAnsi="Arial" w:cs="Arial"/>
-                <w:color w:val="000000"/>
-                <w:sz w:val="24"/>
-                <w:szCs w:val="24"/>
-                <w:lang w:eastAsia="en-NZ"/>
-              </w:rPr>
-            </w:pPr>
-            <w:r>
-              <w:rPr>
-                <w:rFonts w:ascii="Arial" w:eastAsia="Arial" w:hAnsi="Arial" w:cs="Arial"/>
-                <w:color w:val="000000"/>
-                <w:sz w:val="24"/>
-                <w:szCs w:val="24"/>
-                <w:lang w:eastAsia="en-NZ"/>
-              </w:rPr>
-              <w:t>(Snip 3 to 4 different component concepts of your GUI’s component you are trialling here. e.g.</w:t>
-            </w:r>
-            <w:r>
-              <w:rPr>
-                <w:rFonts w:ascii="Arial" w:eastAsia="Arial" w:hAnsi="Arial" w:cs="Arial"/>
-                <w:color w:val="000000"/>
-                <w:sz w:val="24"/>
-                <w:szCs w:val="24"/>
-                <w:lang w:eastAsia="en-NZ"/>
-              </w:rPr>
-              <w:t xml:space="preserve"> Different Layouts using Geometry and/or Canvas</w:t>
-            </w:r>
-            <w:r>
-              <w:rPr>
-                <w:rFonts w:ascii="Arial" w:eastAsia="Arial" w:hAnsi="Arial" w:cs="Arial"/>
-                <w:color w:val="000000"/>
-                <w:sz w:val="24"/>
-                <w:szCs w:val="24"/>
-                <w:lang w:eastAsia="en-NZ"/>
-              </w:rPr>
-              <w:t>)</w:t>
-            </w:r>
-          </w:p>
-          <w:p>
-            <w:pPr>
-              <w:rPr>
-                <w:rFonts w:ascii="Arial" w:eastAsia="Arial" w:hAnsi="Arial" w:cs="Arial"/>
-                <w:color w:val="000000"/>
-                <w:sz w:val="24"/>
-                <w:szCs w:val="24"/>
-                <w:lang w:eastAsia="en-NZ"/>
-              </w:rPr>
-            </w:pPr>
-          </w:p>
-          <w:p>
-            <w:pPr>
-              <w:rPr>
-                <w:rFonts w:ascii="Arial" w:eastAsia="Arial" w:hAnsi="Arial" w:cs="Arial"/>
-                <w:color w:val="000000"/>
-                <w:sz w:val="24"/>
-                <w:szCs w:val="24"/>
-                <w:lang w:eastAsia="en-NZ"/>
-              </w:rPr>
-            </w:pPr>
-          </w:p>
-          <w:p>
-            <w:pPr>
-              <w:rPr>
-                <w:rFonts w:ascii="Arial" w:eastAsia="Arial" w:hAnsi="Arial" w:cs="Arial"/>
-                <w:color w:val="000000"/>
-                <w:sz w:val="24"/>
-                <w:szCs w:val="24"/>
-                <w:lang w:eastAsia="en-NZ"/>
-              </w:rPr>
-            </w:pPr>
+              <w:drawing>
+                <wp:inline distT="0" distB="0" distL="0" distR="0" wp14:anchorId="3E0C8729" wp14:editId="1E4FE4EE">
+                  <wp:extent cx="7390191" cy="2780310"/>
+                  <wp:effectExtent l="0" t="0" r="1270" b="1270"/>
+                  <wp:docPr id="368889162" name="Picture 1"/>
+                  <wp:cNvGraphicFramePr>
+                    <a:graphicFrameLocks xmlns:a="http://schemas.openxmlformats.org/drawingml/2006/main" noChangeAspect="1"/>
+                  </wp:cNvGraphicFramePr>
+                  <a:graphic xmlns:a="http://schemas.openxmlformats.org/drawingml/2006/main">
+                    <a:graphicData uri="http://schemas.openxmlformats.org/drawingml/2006/picture">
+                      <pic:pic xmlns:pic="http://schemas.openxmlformats.org/drawingml/2006/picture">
+                        <pic:nvPicPr>
+                          <pic:cNvPr id="368889162" name=""/>
+                          <pic:cNvPicPr/>
+                        </pic:nvPicPr>
+                        <pic:blipFill>
+                          <a:blip r:embed="rId23"/>
+                          <a:stretch>
+                            <a:fillRect/>
+                          </a:stretch>
+                        </pic:blipFill>
+                        <pic:spPr>
+                          <a:xfrm>
+                            <a:off x="0" y="0"/>
+                            <a:ext cx="7408268" cy="2787111"/>
+                          </a:xfrm>
+                          <a:prstGeom prst="rect">
+                            <a:avLst/>
+                          </a:prstGeom>
+                        </pic:spPr>
+                      </pic:pic>
+                    </a:graphicData>
+                  </a:graphic>
+                </wp:inline>
+              </w:drawing>
+            </w:r>
           </w:p>
         </w:tc>
       </w:tr>
@@ -7728,73 +7525,64 @@
                 <w:szCs w:val="24"/>
                 <w:lang w:eastAsia="en-NZ"/>
               </w:rPr>
-              <w:t xml:space="preserve">(Add snip of results/feedback or recordings here, this could be a pie graph of results or logs of responses, the more feedback the better) </w:t>
-            </w:r>
-          </w:p>
-          <w:p>
-            <w:pPr>
-              <w:rPr>
-                <w:rFonts w:ascii="Arial" w:eastAsia="Arial" w:hAnsi="Arial" w:cs="Arial"/>
-                <w:color w:val="000000"/>
-                <w:sz w:val="24"/>
-                <w:szCs w:val="24"/>
-                <w:lang w:eastAsia="en-NZ"/>
-              </w:rPr>
-            </w:pPr>
-          </w:p>
-          <w:p>
-            <w:pPr>
-              <w:rPr>
-                <w:rFonts w:ascii="Arial" w:eastAsia="Arial" w:hAnsi="Arial" w:cs="Arial"/>
-                <w:color w:val="000000"/>
-                <w:sz w:val="24"/>
-                <w:szCs w:val="24"/>
-                <w:lang w:eastAsia="en-NZ"/>
-              </w:rPr>
-            </w:pPr>
-            <w:r>
-              <w:rPr>
-                <w:rFonts w:ascii="Arial" w:eastAsia="Arial" w:hAnsi="Arial" w:cs="Arial"/>
-                <w:color w:val="000000"/>
-                <w:sz w:val="24"/>
-                <w:szCs w:val="24"/>
-                <w:lang w:eastAsia="en-NZ"/>
-              </w:rPr>
-              <w:t xml:space="preserve">(Add evaluation of your responses here) </w:t>
-            </w:r>
-          </w:p>
-          <w:p>
-            <w:pPr>
-              <w:rPr>
-                <w:rFonts w:ascii="Arial" w:eastAsia="Arial" w:hAnsi="Arial" w:cs="Arial"/>
-                <w:color w:val="000000"/>
-                <w:sz w:val="24"/>
-                <w:szCs w:val="24"/>
-                <w:lang w:eastAsia="en-NZ"/>
-              </w:rPr>
-            </w:pPr>
-          </w:p>
-          <w:p>
-            <w:pPr>
-              <w:rPr>
-                <w:rFonts w:ascii="Arial" w:eastAsia="Arial" w:hAnsi="Arial" w:cs="Arial"/>
-                <w:color w:val="000000"/>
-                <w:sz w:val="24"/>
-                <w:szCs w:val="24"/>
-                <w:lang w:eastAsia="en-NZ"/>
-              </w:rPr>
-            </w:pPr>
-          </w:p>
-          <w:p>
-            <w:pPr>
-              <w:rPr>
-                <w:rFonts w:ascii="Arial" w:eastAsia="Arial" w:hAnsi="Arial" w:cs="Arial"/>
-                <w:color w:val="000000"/>
-                <w:sz w:val="24"/>
-                <w:szCs w:val="24"/>
-                <w:lang w:eastAsia="en-NZ"/>
-              </w:rPr>
-            </w:pPr>
+              <w:drawing>
+                <wp:anchor distT="0" distB="0" distL="114300" distR="114300" simplePos="0" relativeHeight="251659264" behindDoc="0" locked="0" layoutInCell="1" allowOverlap="1" wp14:anchorId="07D892E8" wp14:editId="7444AD78">
+                  <wp:simplePos x="0" y="0"/>
+                  <wp:positionH relativeFrom="column">
+                    <wp:posOffset>3265929</wp:posOffset>
+                  </wp:positionH>
+                  <wp:positionV relativeFrom="paragraph">
+                    <wp:posOffset>48136</wp:posOffset>
+                  </wp:positionV>
+                  <wp:extent cx="4143953" cy="2333951"/>
+                  <wp:effectExtent l="0" t="0" r="0" b="9525"/>
+                  <wp:wrapThrough wrapText="bothSides">
+                    <wp:wrapPolygon edited="0">
+                      <wp:start x="0" y="0"/>
+                      <wp:lineTo x="0" y="21512"/>
+                      <wp:lineTo x="21451" y="21512"/>
+                      <wp:lineTo x="21451" y="0"/>
+                      <wp:lineTo x="0" y="0"/>
+                    </wp:wrapPolygon>
+                  </wp:wrapThrough>
+                  <wp:docPr id="1400915342" name="Picture 1"/>
+                  <wp:cNvGraphicFramePr>
+                    <a:graphicFrameLocks xmlns:a="http://schemas.openxmlformats.org/drawingml/2006/main" noChangeAspect="1"/>
+                  </wp:cNvGraphicFramePr>
+                  <a:graphic xmlns:a="http://schemas.openxmlformats.org/drawingml/2006/main">
+                    <a:graphicData uri="http://schemas.openxmlformats.org/drawingml/2006/picture">
+                      <pic:pic xmlns:pic="http://schemas.openxmlformats.org/drawingml/2006/picture">
+                        <pic:nvPicPr>
+                          <pic:cNvPr id="1400915342" name=""/>
+                          <pic:cNvPicPr/>
+                        </pic:nvPicPr>
+                        <pic:blipFill>
+                          <a:blip r:embed="rId24">
+                            <a:extLst>
+                              <a:ext uri="{28A0092B-C50C-407E-A947-70E740481C1C}">
+                                <a14:useLocalDpi xmlns:a14="http://schemas.microsoft.com/office/drawing/2010/main" val="0"/>
+                              </a:ext>
+                            </a:extLst>
+                          </a:blip>
+                          <a:stretch>
+                            <a:fillRect/>
+                          </a:stretch>
+                        </pic:blipFill>
+                        <pic:spPr>
+                          <a:xfrm>
+                            <a:off x="0" y="0"/>
+                            <a:ext cx="4143953" cy="2333951"/>
+                          </a:xfrm>
+                          <a:prstGeom prst="rect">
+                            <a:avLst/>
+                          </a:prstGeom>
+                        </pic:spPr>
+                      </pic:pic>
+                    </a:graphicData>
+                  </a:graphic>
+                </wp:anchor>
+              </w:drawing>
+            </w:r>
           </w:p>
         </w:tc>
       </w:tr>
@@ -7821,7 +7609,6 @@
                 <w:szCs w:val="24"/>
                 <w:lang w:eastAsia="en-NZ"/>
               </w:rPr>
-              <w:lastRenderedPageBreak/>
               <w:t>Which did I choose and why?</w:t>
             </w:r>
           </w:p>
@@ -7899,14 +7686,22 @@
             </w:r>
             <w:r>
               <w:rPr>
-                <w:rFonts w:ascii="Arial" w:eastAsia="Arial" w:hAnsi="Arial" w:cs="Arial"/>
+                <w:rFonts w:ascii="Arial" w:hAnsi="Arial" w:cs="Arial"/>
                 <w:color w:val="000000"/>
-                <w:sz w:val="24"/>
-                <w:szCs w:val="24"/>
-                <w:lang w:eastAsia="en-NZ"/>
-              </w:rPr>
-              <w:t>(STATE WHAT IS YOUR CHOSEN COMPONENT HERE)</w:t>
-            </w:r>
+                <w:shd w:val="clear" w:color="auto" w:fill="FFFFFF"/>
+              </w:rPr>
+              <w:t xml:space="preserve">Different Admin displays of user </w:t>
+            </w:r>
+            <w:proofErr w:type="spellStart"/>
+            <w:r>
+              <w:rPr>
+                <w:rFonts w:ascii="Arial" w:hAnsi="Arial" w:cs="Arial"/>
+                <w:color w:val="000000"/>
+                <w:shd w:val="clear" w:color="auto" w:fill="FFFFFF"/>
+              </w:rPr>
+              <w:t>reciepts</w:t>
+            </w:r>
+            <w:proofErr w:type="spellEnd"/>
           </w:p>
         </w:tc>
       </w:tr>
@@ -7944,7 +7739,7 @@
                 <w:szCs w:val="24"/>
                 <w:lang w:eastAsia="en-NZ"/>
               </w:rPr>
-              <w:t xml:space="preserve">Trialling Iteration: </w:t>
+              <w:t xml:space="preserve">Trialling: </w:t>
             </w:r>
           </w:p>
         </w:tc>
@@ -7962,9 +7757,7 @@
                 <w:lang w:eastAsia="en-NZ"/>
               </w:rPr>
             </w:pPr>
-          </w:p>
-          <w:p>
-            <w:pPr>
+            <w:r>
               <w:rPr>
                 <w:rFonts w:ascii="Arial" w:eastAsia="Arial" w:hAnsi="Arial" w:cs="Arial"/>
                 <w:color w:val="000000"/>
@@ -7972,61 +7765,42 @@
                 <w:szCs w:val="24"/>
                 <w:lang w:eastAsia="en-NZ"/>
               </w:rPr>
-            </w:pPr>
-          </w:p>
-          <w:p>
-            <w:pPr>
-              <w:rPr>
-                <w:rFonts w:ascii="Arial" w:eastAsia="Arial" w:hAnsi="Arial" w:cs="Arial"/>
-                <w:color w:val="000000"/>
-                <w:sz w:val="24"/>
-                <w:szCs w:val="24"/>
-                <w:lang w:eastAsia="en-NZ"/>
-              </w:rPr>
-            </w:pPr>
-            <w:r>
-              <w:rPr>
-                <w:rFonts w:ascii="Arial" w:eastAsia="Arial" w:hAnsi="Arial" w:cs="Arial"/>
-                <w:color w:val="000000"/>
-                <w:sz w:val="24"/>
-                <w:szCs w:val="24"/>
-                <w:lang w:eastAsia="en-NZ"/>
-              </w:rPr>
-              <w:t>(Snip 3 to 4 different component concepts of your GUI’s component you are trialling here. e.g.)</w:t>
-            </w:r>
-          </w:p>
-          <w:p>
-            <w:pPr>
-              <w:rPr>
-                <w:rFonts w:ascii="Arial" w:eastAsia="Arial" w:hAnsi="Arial" w:cs="Arial"/>
-                <w:color w:val="000000"/>
-                <w:sz w:val="24"/>
-                <w:szCs w:val="24"/>
-                <w:lang w:eastAsia="en-NZ"/>
-              </w:rPr>
-            </w:pPr>
-          </w:p>
-          <w:p>
-            <w:pPr>
-              <w:rPr>
-                <w:rFonts w:ascii="Arial" w:eastAsia="Arial" w:hAnsi="Arial" w:cs="Arial"/>
-                <w:color w:val="000000"/>
-                <w:sz w:val="24"/>
-                <w:szCs w:val="24"/>
-                <w:lang w:eastAsia="en-NZ"/>
-              </w:rPr>
-            </w:pPr>
-          </w:p>
-          <w:p>
-            <w:pPr>
-              <w:rPr>
-                <w:rFonts w:ascii="Arial" w:eastAsia="Arial" w:hAnsi="Arial" w:cs="Arial"/>
-                <w:color w:val="000000"/>
-                <w:sz w:val="24"/>
-                <w:szCs w:val="24"/>
-                <w:lang w:eastAsia="en-NZ"/>
-              </w:rPr>
-            </w:pPr>
+              <w:drawing>
+                <wp:inline distT="0" distB="0" distL="0" distR="0" wp14:anchorId="59EFC503" wp14:editId="5E65ED4A">
+                  <wp:extent cx="7163800" cy="2267266"/>
+                  <wp:effectExtent l="0" t="0" r="0" b="0"/>
+                  <wp:docPr id="234924685" name="Picture 1"/>
+                  <wp:cNvGraphicFramePr>
+                    <a:graphicFrameLocks xmlns:a="http://schemas.openxmlformats.org/drawingml/2006/main" noChangeAspect="1"/>
+                  </wp:cNvGraphicFramePr>
+                  <a:graphic xmlns:a="http://schemas.openxmlformats.org/drawingml/2006/main">
+                    <a:graphicData uri="http://schemas.openxmlformats.org/drawingml/2006/picture">
+                      <pic:pic xmlns:pic="http://schemas.openxmlformats.org/drawingml/2006/picture">
+                        <pic:nvPicPr>
+                          <pic:cNvPr id="234924685" name=""/>
+                          <pic:cNvPicPr/>
+                        </pic:nvPicPr>
+                        <pic:blipFill>
+                          <a:blip r:embed="rId25"/>
+                          <a:stretch>
+                            <a:fillRect/>
+                          </a:stretch>
+                        </pic:blipFill>
+                        <pic:spPr>
+                          <a:xfrm>
+                            <a:off x="0" y="0"/>
+                            <a:ext cx="7163800" cy="2267266"/>
+                          </a:xfrm>
+                          <a:prstGeom prst="rect">
+                            <a:avLst/>
+                          </a:prstGeom>
+                        </pic:spPr>
+                      </pic:pic>
+                    </a:graphicData>
+                  </a:graphic>
+                </wp:inline>
+              </w:drawing>
+            </w:r>
           </w:p>
         </w:tc>
       </w:tr>
@@ -8079,73 +7853,64 @@
                 <w:szCs w:val="24"/>
                 <w:lang w:eastAsia="en-NZ"/>
               </w:rPr>
-              <w:t xml:space="preserve">(Add snip of results/feedback or recordings here, this could be a pie graph of results or logs of responses, the more feedback the better) </w:t>
-            </w:r>
-          </w:p>
-          <w:p>
-            <w:pPr>
-              <w:rPr>
-                <w:rFonts w:ascii="Arial" w:eastAsia="Arial" w:hAnsi="Arial" w:cs="Arial"/>
-                <w:color w:val="000000"/>
-                <w:sz w:val="24"/>
-                <w:szCs w:val="24"/>
-                <w:lang w:eastAsia="en-NZ"/>
-              </w:rPr>
-            </w:pPr>
-          </w:p>
-          <w:p>
-            <w:pPr>
-              <w:rPr>
-                <w:rFonts w:ascii="Arial" w:eastAsia="Arial" w:hAnsi="Arial" w:cs="Arial"/>
-                <w:color w:val="000000"/>
-                <w:sz w:val="24"/>
-                <w:szCs w:val="24"/>
-                <w:lang w:eastAsia="en-NZ"/>
-              </w:rPr>
-            </w:pPr>
-            <w:r>
-              <w:rPr>
-                <w:rFonts w:ascii="Arial" w:eastAsia="Arial" w:hAnsi="Arial" w:cs="Arial"/>
-                <w:color w:val="000000"/>
-                <w:sz w:val="24"/>
-                <w:szCs w:val="24"/>
-                <w:lang w:eastAsia="en-NZ"/>
-              </w:rPr>
-              <w:t xml:space="preserve">(Add evaluation of your responses here) </w:t>
-            </w:r>
-          </w:p>
-          <w:p>
-            <w:pPr>
-              <w:rPr>
-                <w:rFonts w:ascii="Arial" w:eastAsia="Arial" w:hAnsi="Arial" w:cs="Arial"/>
-                <w:color w:val="000000"/>
-                <w:sz w:val="24"/>
-                <w:szCs w:val="24"/>
-                <w:lang w:eastAsia="en-NZ"/>
-              </w:rPr>
-            </w:pPr>
-          </w:p>
-          <w:p>
-            <w:pPr>
-              <w:rPr>
-                <w:rFonts w:ascii="Arial" w:eastAsia="Arial" w:hAnsi="Arial" w:cs="Arial"/>
-                <w:color w:val="000000"/>
-                <w:sz w:val="24"/>
-                <w:szCs w:val="24"/>
-                <w:lang w:eastAsia="en-NZ"/>
-              </w:rPr>
-            </w:pPr>
-          </w:p>
-          <w:p>
-            <w:pPr>
-              <w:rPr>
-                <w:rFonts w:ascii="Arial" w:eastAsia="Arial" w:hAnsi="Arial" w:cs="Arial"/>
-                <w:color w:val="000000"/>
-                <w:sz w:val="24"/>
-                <w:szCs w:val="24"/>
-                <w:lang w:eastAsia="en-NZ"/>
-              </w:rPr>
-            </w:pPr>
+              <w:drawing>
+                <wp:anchor distT="0" distB="0" distL="114300" distR="114300" simplePos="0" relativeHeight="251660288" behindDoc="0" locked="0" layoutInCell="1" allowOverlap="1" wp14:anchorId="3CC30EF8" wp14:editId="411920DE">
+                  <wp:simplePos x="0" y="0"/>
+                  <wp:positionH relativeFrom="column">
+                    <wp:posOffset>3616515</wp:posOffset>
+                  </wp:positionH>
+                  <wp:positionV relativeFrom="paragraph">
+                    <wp:posOffset>223</wp:posOffset>
+                  </wp:positionV>
+                  <wp:extent cx="4001058" cy="2438740"/>
+                  <wp:effectExtent l="0" t="0" r="0" b="0"/>
+                  <wp:wrapThrough wrapText="bothSides">
+                    <wp:wrapPolygon edited="0">
+                      <wp:start x="0" y="0"/>
+                      <wp:lineTo x="0" y="21431"/>
+                      <wp:lineTo x="21497" y="21431"/>
+                      <wp:lineTo x="21497" y="0"/>
+                      <wp:lineTo x="0" y="0"/>
+                    </wp:wrapPolygon>
+                  </wp:wrapThrough>
+                  <wp:docPr id="488762068" name="Picture 1"/>
+                  <wp:cNvGraphicFramePr>
+                    <a:graphicFrameLocks xmlns:a="http://schemas.openxmlformats.org/drawingml/2006/main" noChangeAspect="1"/>
+                  </wp:cNvGraphicFramePr>
+                  <a:graphic xmlns:a="http://schemas.openxmlformats.org/drawingml/2006/main">
+                    <a:graphicData uri="http://schemas.openxmlformats.org/drawingml/2006/picture">
+                      <pic:pic xmlns:pic="http://schemas.openxmlformats.org/drawingml/2006/picture">
+                        <pic:nvPicPr>
+                          <pic:cNvPr id="488762068" name=""/>
+                          <pic:cNvPicPr/>
+                        </pic:nvPicPr>
+                        <pic:blipFill>
+                          <a:blip r:embed="rId26">
+                            <a:extLst>
+                              <a:ext uri="{28A0092B-C50C-407E-A947-70E740481C1C}">
+                                <a14:useLocalDpi xmlns:a14="http://schemas.microsoft.com/office/drawing/2010/main" val="0"/>
+                              </a:ext>
+                            </a:extLst>
+                          </a:blip>
+                          <a:stretch>
+                            <a:fillRect/>
+                          </a:stretch>
+                        </pic:blipFill>
+                        <pic:spPr>
+                          <a:xfrm>
+                            <a:off x="0" y="0"/>
+                            <a:ext cx="4001058" cy="2438740"/>
+                          </a:xfrm>
+                          <a:prstGeom prst="rect">
+                            <a:avLst/>
+                          </a:prstGeom>
+                        </pic:spPr>
+                      </pic:pic>
+                    </a:graphicData>
+                  </a:graphic>
+                </wp:anchor>
+              </w:drawing>
+            </w:r>
           </w:p>
         </w:tc>
       </w:tr>
@@ -8785,7 +8550,67 @@
           <w:sz w:val="25"/>
           <w:szCs w:val="25"/>
         </w:rPr>
-        <w:t xml:space="preserve">Assessment schedule/Mahere Aromatawai: Digital Technologies &amp; Hangarau Matihiko 91897 </w:t>
+        <w:t xml:space="preserve">Assessment schedule/Mahere </w:t>
+      </w:r>
+      <w:proofErr w:type="spellStart"/>
+      <w:r>
+        <w:rPr>
+          <w:rFonts w:ascii="Arial" w:eastAsia="Arial" w:hAnsi="Arial" w:cs="Arial"/>
+          <w:b/>
+          <w:sz w:val="25"/>
+          <w:szCs w:val="25"/>
+        </w:rPr>
+        <w:t>Aromatawai</w:t>
+      </w:r>
+      <w:proofErr w:type="spellEnd"/>
+      <w:r>
+        <w:rPr>
+          <w:rFonts w:ascii="Arial" w:eastAsia="Arial" w:hAnsi="Arial" w:cs="Arial"/>
+          <w:b/>
+          <w:sz w:val="25"/>
+          <w:szCs w:val="25"/>
+        </w:rPr>
+        <w:t xml:space="preserve">: Digital Technologies &amp; </w:t>
+      </w:r>
+      <w:proofErr w:type="spellStart"/>
+      <w:r>
+        <w:rPr>
+          <w:rFonts w:ascii="Arial" w:eastAsia="Arial" w:hAnsi="Arial" w:cs="Arial"/>
+          <w:b/>
+          <w:sz w:val="25"/>
+          <w:szCs w:val="25"/>
+        </w:rPr>
+        <w:t>Hangarau</w:t>
+      </w:r>
+      <w:proofErr w:type="spellEnd"/>
+      <w:r>
+        <w:rPr>
+          <w:rFonts w:ascii="Arial" w:eastAsia="Arial" w:hAnsi="Arial" w:cs="Arial"/>
+          <w:b/>
+          <w:sz w:val="25"/>
+          <w:szCs w:val="25"/>
+        </w:rPr>
+        <w:t xml:space="preserve"> </w:t>
+      </w:r>
+      <w:proofErr w:type="spellStart"/>
+      <w:r>
+        <w:rPr>
+          <w:rFonts w:ascii="Arial" w:eastAsia="Arial" w:hAnsi="Arial" w:cs="Arial"/>
+          <w:b/>
+          <w:sz w:val="25"/>
+          <w:szCs w:val="25"/>
+        </w:rPr>
+        <w:t>Matihiko</w:t>
+      </w:r>
+      <w:proofErr w:type="spellEnd"/>
+      <w:r>
+        <w:rPr>
+          <w:rFonts w:ascii="Arial" w:eastAsia="Arial" w:hAnsi="Arial" w:cs="Arial"/>
+          <w:b/>
+          <w:sz w:val="25"/>
+          <w:szCs w:val="25"/>
+        </w:rPr>
+        <w:t xml:space="preserve"> 91897 </w:t>
       </w:r>
       <w:r>
         <w:rPr>
@@ -8851,8 +8676,17 @@
                 <w:rFonts w:ascii="Arial" w:eastAsia="Arial" w:hAnsi="Arial" w:cs="Arial"/>
                 <w:b/>
               </w:rPr>
-              <w:t>Evidence/Judgements for Achievement/Paetae</w:t>
-            </w:r>
+              <w:t>Evidence/Judgements for Achievement/</w:t>
+            </w:r>
+            <w:proofErr w:type="spellStart"/>
+            <w:r>
+              <w:rPr>
+                <w:rFonts w:ascii="Arial" w:eastAsia="Arial" w:hAnsi="Arial" w:cs="Arial"/>
+                <w:b/>
+              </w:rPr>
+              <w:t>Paetae</w:t>
+            </w:r>
+            <w:proofErr w:type="spellEnd"/>
           </w:p>
         </w:tc>
         <w:tc>
@@ -8896,8 +8730,17 @@
                 <w:rFonts w:ascii="Arial" w:eastAsia="Arial" w:hAnsi="Arial" w:cs="Arial"/>
                 <w:b/>
               </w:rPr>
-              <w:t>Evidence/Judgements for Achievement with Excellence/Kairangi</w:t>
-            </w:r>
+              <w:t>Evidence/Judgements for Achievement with Excellence/</w:t>
+            </w:r>
+            <w:proofErr w:type="spellStart"/>
+            <w:r>
+              <w:rPr>
+                <w:rFonts w:ascii="Arial" w:eastAsia="Arial" w:hAnsi="Arial" w:cs="Arial"/>
+                <w:b/>
+              </w:rPr>
+              <w:t>Kairangi</w:t>
+            </w:r>
+            <w:proofErr w:type="spellEnd"/>
           </w:p>
         </w:tc>
       </w:tr>
@@ -13914,12 +13757,24 @@
 </file>
 
 <file path=customXml/item1.xml><?xml version="1.0" encoding="utf-8"?>
+<b:Sources xmlns:b="http://schemas.openxmlformats.org/officeDocument/2006/bibliography" xmlns="http://schemas.openxmlformats.org/officeDocument/2006/bibliography" SelectedStyle="/APASixthEditionOfficeOnline.xsl" StyleName="APA" Version="6"/>
+</file>
+
+<file path=customXml/item2.xml><?xml version="1.0" encoding="utf-8"?>
 <go:gDocsCustomXmlDataStorage xmlns:go="http://customooxmlschemas.google.com/" xmlns:r="http://schemas.openxmlformats.org/officeDocument/2006/relationships" uri="GoogleDocsCustomDataVersion2">
   <go:docsCustomData xmlns:go="http://customooxmlschemas.google.com/" roundtripDataSignature="AMtx7miNGY9E4MfvGz93g/DJwGpzIziqLg==">CgMxLjA4AHIhMS0yckpnUjhGTl81NjNkN1ZCZUJQOWFBa2RyTFhJSUZ2</go:docsCustomData>
 </go:gDocsCustomXmlDataStorage>
 </file>
 
 <file path=customXml/itemProps1.xml><?xml version="1.0" encoding="utf-8"?>
+<ds:datastoreItem xmlns:ds="http://schemas.openxmlformats.org/officeDocument/2006/customXml" ds:itemID="{A58A12FC-9D26-524B-AA61-514EC6263EFC}">
+  <ds:schemaRefs>
+    <ds:schemaRef ds:uri="http://schemas.openxmlformats.org/officeDocument/2006/bibliography"/>
+  </ds:schemaRefs>
+</ds:datastoreItem>
+</file>
+
+<file path=customXml/itemProps2.xml><?xml version="1.0" encoding="utf-8"?>
 <ds:datastoreItem xmlns:ds="http://schemas.openxmlformats.org/officeDocument/2006/customXml" ds:itemID="{11111111-1234-1234-1234-123412341234}">
   <ds:schemaRefs>
     <ds:schemaRef ds:uri="http://customooxmlschemas.google.com/"/>

</xml_diff>